<commit_message>
EHIS-5835 [ Inspection report template issues]
</commit_message>
<xml_diff>
--- a/PHOCS-Docgentemplates/PHOCSInspReportTemplate.docx
+++ b/PHOCS-Docgentemplates/PHOCSInspReportTemplate.docx
@@ -1,6 +1,6 @@
 
 <file path=word/document.xml><?xml version="1.0" encoding="utf-8"?>
-<w:document xmlns:wpc="http://schemas.microsoft.com/office/word/2010/wordprocessingCanvas" xmlns:cx="http://schemas.microsoft.com/office/drawing/2014/chartex" xmlns:cx1="http://schemas.microsoft.com/office/drawing/2015/9/8/chartex" xmlns:cx2="http://schemas.microsoft.com/office/drawing/2015/10/21/chartex" xmlns:cx3="http://schemas.microsoft.com/office/drawing/2016/5/9/chartex" xmlns:cx4="http://schemas.microsoft.com/office/drawing/2016/5/10/chartex" xmlns:cx5="http://schemas.microsoft.com/office/drawing/2016/5/11/chartex" xmlns:cx6="http://schemas.microsoft.com/office/drawing/2016/5/12/chartex" xmlns:cx7="http://schemas.microsoft.com/office/drawing/2016/5/13/chartex" xmlns:cx8="http://schemas.microsoft.com/office/drawing/2016/5/14/chartex" xmlns:mc="http://schemas.openxmlformats.org/markup-compatibility/2006" xmlns:aink="http://schemas.microsoft.com/office/drawing/2016/ink" xmlns:am3d="http://schemas.microsoft.com/office/drawing/2017/model3d" xmlns:o="urn:schemas-microsoft-com:office:office" xmlns:oel="http://schemas.microsoft.com/office/2019/extlst" xmlns:r="http://schemas.openxmlformats.org/officeDocument/2006/relationships" xmlns:m="http://schemas.openxmlformats.org/officeDocument/2006/math" xmlns:v="urn:schemas-microsoft-com:vml" xmlns:wp14="http://schemas.microsoft.com/office/word/2010/wordprocessingDrawing" xmlns:wp="http://schemas.openxmlformats.org/drawingml/2006/wordprocessingDrawing" xmlns:w10="urn:schemas-microsoft-com:office:word" xmlns:w="http://schemas.openxmlformats.org/wordprocessingml/2006/main" xmlns:w14="http://schemas.microsoft.com/office/word/2010/wordml" xmlns:w15="http://schemas.microsoft.com/office/word/2012/wordml" xmlns:w16cei="http://schemas.microsoft.com/office/word/2026/wordml/cei" xmlns:w16cex="http://schemas.microsoft.com/office/word/2018/wordml/cex" xmlns:w16cid="http://schemas.microsoft.com/office/word/2016/wordml/cid" xmlns:w16="http://schemas.microsoft.com/office/word/2018/wordml" xmlns:w16du="http://schemas.microsoft.com/office/word/2023/wordml/word16du" xmlns:w16sdtdh="http://schemas.microsoft.com/office/word/2020/wordml/sdtdatahash" xmlns:w16sdtfl="http://schemas.microsoft.com/office/word/2024/wordml/sdtformatlock" xmlns:w16se="http://schemas.microsoft.com/office/word/2015/wordml/symex" xmlns:wpg="http://schemas.microsoft.com/office/word/2010/wordprocessingGroup" xmlns:wpi="http://schemas.microsoft.com/office/word/2010/wordprocessingInk" xmlns:wne="http://schemas.microsoft.com/office/word/2006/wordml" xmlns:wps="http://schemas.microsoft.com/office/word/2010/wordprocessingShape" mc:Ignorable="w14 w15 w16se w16cid w16 w16cex w16sdtdh w16sdtfl w16du wp14">
+<w:document xmlns:wpc="http://schemas.microsoft.com/office/word/2010/wordprocessingCanvas" xmlns:cx="http://schemas.microsoft.com/office/drawing/2014/chartex" xmlns:cx1="http://schemas.microsoft.com/office/drawing/2015/9/8/chartex" xmlns:cx2="http://schemas.microsoft.com/office/drawing/2015/10/21/chartex" xmlns:cx3="http://schemas.microsoft.com/office/drawing/2016/5/9/chartex" xmlns:cx4="http://schemas.microsoft.com/office/drawing/2016/5/10/chartex" xmlns:cx5="http://schemas.microsoft.com/office/drawing/2016/5/11/chartex" xmlns:cx6="http://schemas.microsoft.com/office/drawing/2016/5/12/chartex" xmlns:cx7="http://schemas.microsoft.com/office/drawing/2016/5/13/chartex" xmlns:cx8="http://schemas.microsoft.com/office/drawing/2016/5/14/chartex" xmlns:mc="http://schemas.openxmlformats.org/markup-compatibility/2006" xmlns:aink="http://schemas.microsoft.com/office/drawing/2016/ink" xmlns:am3d="http://schemas.microsoft.com/office/drawing/2017/model3d" xmlns:o="urn:schemas-microsoft-com:office:office" xmlns:oel="http://schemas.microsoft.com/office/2019/extlst" xmlns:r="http://schemas.openxmlformats.org/officeDocument/2006/relationships" xmlns:m="http://schemas.openxmlformats.org/officeDocument/2006/math" xmlns:v="urn:schemas-microsoft-com:vml" xmlns:wp14="http://schemas.microsoft.com/office/word/2010/wordprocessingDrawing" xmlns:wp="http://schemas.openxmlformats.org/drawingml/2006/wordprocessingDrawing" xmlns:w10="urn:schemas-microsoft-com:office:word" xmlns:w="http://schemas.openxmlformats.org/wordprocessingml/2006/main" xmlns:w14="http://schemas.microsoft.com/office/word/2010/wordml" xmlns:w15="http://schemas.microsoft.com/office/word/2012/wordml" xmlns:w16cex="http://schemas.microsoft.com/office/word/2018/wordml/cex" xmlns:w16cid="http://schemas.microsoft.com/office/word/2016/wordml/cid" xmlns:w16="http://schemas.microsoft.com/office/word/2018/wordml" xmlns:w16du="http://schemas.microsoft.com/office/word/2023/wordml/word16du" xmlns:w16sdtdh="http://schemas.microsoft.com/office/word/2020/wordml/sdtdatahash" xmlns:w16sdtfl="http://schemas.microsoft.com/office/word/2024/wordml/sdtformatlock" xmlns:w16se="http://schemas.microsoft.com/office/word/2015/wordml/symex" xmlns:wpg="http://schemas.microsoft.com/office/word/2010/wordprocessingGroup" xmlns:wpi="http://schemas.microsoft.com/office/word/2010/wordprocessingInk" xmlns:wne="http://schemas.microsoft.com/office/word/2006/wordml" xmlns:wps="http://schemas.microsoft.com/office/word/2010/wordprocessingShape" mc:Ignorable="w14 w15 w16se w16cid w16 w16cex w16sdtdh w16sdtfl w16du wp14">
   <w:body>
     <w:tbl>
       <w:tblPr>
@@ -125,20 +125,7 @@
                 <w:szCs w:val="24"/>
                 <w:lang w:val="en-US"/>
               </w:rPr>
-              <w:t xml:space="preserve">Inspection </w:t>
-            </w:r>
-            <w:proofErr w:type="gramStart"/>
-            <w:r>
-              <w:rPr>
-                <w:rFonts w:ascii="BC Sans" w:eastAsia="BC Sans" w:hAnsi="BC Sans" w:cs="BC Sans"/>
-                <w:b/>
-                <w:bCs/>
-                <w:color w:val="1A1A2E"/>
-                <w:sz w:val="24"/>
-                <w:szCs w:val="24"/>
-                <w:lang w:val="en-US"/>
-              </w:rPr>
-              <w:t xml:space="preserve">Date: </w:t>
+              <w:t xml:space="preserve">Inspection Date: </w:t>
             </w:r>
             <w:r>
               <w:rPr>
@@ -161,7 +148,6 @@
               <w:t>{</w:t>
             </w:r>
             <w:proofErr w:type="spellStart"/>
-            <w:proofErr w:type="gramEnd"/>
             <w:r>
               <w:rPr>
                 <w:rFonts w:ascii="BC Sans" w:eastAsia="BC Sans" w:hAnsi="BC Sans" w:cs="BC Sans"/>
@@ -212,20 +198,7 @@
                 <w:szCs w:val="24"/>
                 <w:lang w:val="en-US"/>
               </w:rPr>
-              <w:t xml:space="preserve">Inspection </w:t>
-            </w:r>
-            <w:proofErr w:type="gramStart"/>
-            <w:r>
-              <w:rPr>
-                <w:rFonts w:ascii="BC Sans" w:eastAsia="BC Sans" w:hAnsi="BC Sans" w:cs="BC Sans"/>
-                <w:b/>
-                <w:bCs/>
-                <w:color w:val="1A1A2E"/>
-                <w:sz w:val="24"/>
-                <w:szCs w:val="24"/>
-                <w:lang w:val="en-US"/>
-              </w:rPr>
-              <w:t xml:space="preserve">Type: </w:t>
+              <w:t xml:space="preserve">Inspection Type: </w:t>
             </w:r>
             <w:r>
               <w:rPr>
@@ -248,7 +221,6 @@
               <w:t>{</w:t>
             </w:r>
             <w:proofErr w:type="spellStart"/>
-            <w:proofErr w:type="gramEnd"/>
             <w:r>
               <w:rPr>
                 <w:rFonts w:ascii="BC Sans" w:eastAsia="BC Sans" w:hAnsi="BC Sans" w:cs="BC Sans"/>
@@ -634,9 +606,8 @@
                 <w:szCs w:val="24"/>
                 <w:lang w:val="en-US"/>
               </w:rPr>
-              <w:t>{{#timeSpent</w:t>
-            </w:r>
-            <w:proofErr w:type="gramStart"/>
+              <w:t>{{#timeSpent}}</w:t>
+            </w:r>
             <w:r>
               <w:rPr>
                 <w:rFonts w:ascii="BC Sans" w:eastAsia="BC Sans" w:hAnsi="BC Sans" w:cs="BC Sans"/>
@@ -647,32 +618,7 @@
                 <w:szCs w:val="24"/>
                 <w:lang w:val="en-US"/>
               </w:rPr>
-              <w:t>}}</w:t>
-            </w:r>
-            <w:r>
-              <w:rPr>
-                <w:rFonts w:ascii="BC Sans" w:eastAsia="BC Sans" w:hAnsi="BC Sans" w:cs="BC Sans"/>
-                <w:b/>
-                <w:bCs/>
-                <w:color w:val="1A1A2E"/>
-                <w:sz w:val="24"/>
-                <w:szCs w:val="24"/>
-                <w:lang w:val="en-US"/>
-              </w:rPr>
-              <w:t>Time</w:t>
-            </w:r>
-            <w:proofErr w:type="gramEnd"/>
-            <w:r>
-              <w:rPr>
-                <w:rFonts w:ascii="BC Sans" w:eastAsia="BC Sans" w:hAnsi="BC Sans" w:cs="BC Sans"/>
-                <w:b/>
-                <w:bCs/>
-                <w:color w:val="1A1A2E"/>
-                <w:sz w:val="24"/>
-                <w:szCs w:val="24"/>
-                <w:lang w:val="en-US"/>
-              </w:rPr>
-              <w:t xml:space="preserve"> Spent: </w:t>
+              <w:t xml:space="preserve">Time Spent: </w:t>
             </w:r>
             <w:r>
               <w:rPr>
@@ -705,27 +651,15 @@
               <w:t>timeSpent</w:t>
             </w:r>
             <w:proofErr w:type="spellEnd"/>
-            <w:proofErr w:type="gramStart"/>
-            <w:r>
-              <w:rPr>
-                <w:rFonts w:ascii="BC Sans" w:eastAsia="BC Sans" w:hAnsi="BC Sans" w:cs="BC Sans"/>
-                <w:color w:val="1A1A2E"/>
-                <w:sz w:val="24"/>
-                <w:szCs w:val="24"/>
-                <w:lang w:val="en-US"/>
-              </w:rPr>
-              <w:t>}}{</w:t>
-            </w:r>
-            <w:proofErr w:type="gramEnd"/>
-            <w:r>
-              <w:rPr>
-                <w:rFonts w:ascii="BC Sans" w:eastAsia="BC Sans" w:hAnsi="BC Sans" w:cs="BC Sans"/>
-                <w:color w:val="1A1A2E"/>
-                <w:sz w:val="24"/>
-                <w:szCs w:val="24"/>
-                <w:lang w:val="en-US"/>
-              </w:rPr>
-              <w:t>{/</w:t>
+            <w:r>
+              <w:rPr>
+                <w:rFonts w:ascii="BC Sans" w:eastAsia="BC Sans" w:hAnsi="BC Sans" w:cs="BC Sans"/>
+                <w:color w:val="1A1A2E"/>
+                <w:sz w:val="24"/>
+                <w:szCs w:val="24"/>
+                <w:lang w:val="en-US"/>
+              </w:rPr>
+              <w:t>}}{{/</w:t>
             </w:r>
             <w:proofErr w:type="spellStart"/>
             <w:r>
@@ -771,7 +705,6 @@
                 <w:lang w:val="en-US"/>
               </w:rPr>
             </w:pPr>
-            <w:proofErr w:type="gramStart"/>
             <w:r>
               <w:rPr>
                 <w:rFonts w:ascii="BC Sans" w:eastAsia="BC Sans" w:hAnsi="BC Sans" w:cs="BC Sans"/>
@@ -812,7 +745,6 @@
               </w:rPr>
               <w:t>{</w:t>
             </w:r>
-            <w:proofErr w:type="gramEnd"/>
             <w:r>
               <w:rPr>
                 <w:rFonts w:ascii="BC Sans" w:eastAsia="BC Sans" w:hAnsi="BC Sans" w:cs="BC Sans"/>
@@ -888,16 +820,24 @@
               </w:rPr>
               <w:t xml:space="preserve"> Contact Info:</w:t>
             </w:r>
-          </w:p>
-          <w:p>
-            <w:pPr>
-              <w:spacing w:line="276" w:lineRule="auto"/>
-              <w:rPr>
-                <w:rFonts w:ascii="BC Sans" w:eastAsia="BC Sans" w:hAnsi="BC Sans" w:cs="BC Sans"/>
-                <w:sz w:val="24"/>
-                <w:szCs w:val="24"/>
-              </w:rPr>
-            </w:pPr>
+            <w:r>
+              <w:rPr>
+                <w:rFonts w:ascii="BC Sans" w:eastAsia="BC Sans" w:hAnsi="BC Sans" w:cs="BC Sans"/>
+                <w:sz w:val="24"/>
+                <w:szCs w:val="24"/>
+                <w:lang w:val="en-CA"/>
+              </w:rPr>
+              <w:t>{{#IF_showOperatorEmail}}</w:t>
+            </w:r>
+            <w:r>
+              <w:rPr>
+                <w:rFonts w:ascii="BC Sans" w:eastAsia="BC Sans" w:hAnsi="BC Sans" w:cs="BC Sans"/>
+                <w:sz w:val="24"/>
+                <w:szCs w:val="24"/>
+                <w:lang w:val="en-CA"/>
+              </w:rPr>
+              <w:br/>
+            </w:r>
             <w:r>
               <w:rPr>
                 <w:rFonts w:ascii="BC Sans" w:eastAsia="BC Sans" w:hAnsi="BC Sans" w:cs="BC Sans"/>
@@ -913,18 +853,9 @@
                 <w:sz w:val="24"/>
                 <w:szCs w:val="24"/>
               </w:rPr>
-              <w:t>operator</w:t>
-            </w:r>
-            <w:r>
-              <w:rPr>
-                <w:rFonts w:ascii="BC Sans" w:eastAsia="BC Sans" w:hAnsi="BC Sans" w:cs="BC Sans"/>
-                <w:sz w:val="24"/>
-                <w:szCs w:val="24"/>
-              </w:rPr>
-              <w:t>Email</w:t>
+              <w:t>operatorEmail</w:t>
             </w:r>
             <w:proofErr w:type="spellEnd"/>
-            <w:proofErr w:type="gramStart"/>
             <w:r>
               <w:rPr>
                 <w:rFonts w:ascii="BC Sans" w:eastAsia="BC Sans" w:hAnsi="BC Sans" w:cs="BC Sans"/>
@@ -938,17 +869,46 @@
                 <w:rFonts w:ascii="BC Sans" w:eastAsia="BC Sans" w:hAnsi="BC Sans" w:cs="BC Sans"/>
                 <w:sz w:val="24"/>
                 <w:szCs w:val="24"/>
-              </w:rPr>
-              <w:t>{</w:t>
-            </w:r>
-            <w:proofErr w:type="gramEnd"/>
-            <w:r>
-              <w:rPr>
-                <w:rFonts w:ascii="BC Sans" w:eastAsia="BC Sans" w:hAnsi="BC Sans" w:cs="BC Sans"/>
-                <w:sz w:val="24"/>
-                <w:szCs w:val="24"/>
-              </w:rPr>
-              <w:t>{#IF_showOperatorPhone}}</w:t>
+                <w:lang w:val="en-CA"/>
+              </w:rPr>
+              <w:t>{{</w:t>
+            </w:r>
+            <w:r>
+              <w:rPr>
+                <w:rFonts w:ascii="BC Sans" w:eastAsia="BC Sans" w:hAnsi="BC Sans" w:cs="BC Sans"/>
+                <w:sz w:val="24"/>
+                <w:szCs w:val="24"/>
+                <w:lang w:val="en-CA"/>
+              </w:rPr>
+              <w:t>/</w:t>
+            </w:r>
+            <w:proofErr w:type="spellStart"/>
+            <w:r>
+              <w:rPr>
+                <w:rFonts w:ascii="BC Sans" w:eastAsia="BC Sans" w:hAnsi="BC Sans" w:cs="BC Sans"/>
+                <w:sz w:val="24"/>
+                <w:szCs w:val="24"/>
+                <w:lang w:val="en-CA"/>
+              </w:rPr>
+              <w:t>IF_showOperatorEmail</w:t>
+            </w:r>
+            <w:proofErr w:type="spellEnd"/>
+            <w:r>
+              <w:rPr>
+                <w:rFonts w:ascii="BC Sans" w:eastAsia="BC Sans" w:hAnsi="BC Sans" w:cs="BC Sans"/>
+                <w:sz w:val="24"/>
+                <w:szCs w:val="24"/>
+                <w:lang w:val="en-CA"/>
+              </w:rPr>
+              <w:t>}}</w:t>
+            </w:r>
+            <w:r>
+              <w:rPr>
+                <w:rFonts w:ascii="BC Sans" w:eastAsia="BC Sans" w:hAnsi="BC Sans" w:cs="BC Sans"/>
+                <w:sz w:val="24"/>
+                <w:szCs w:val="24"/>
+              </w:rPr>
+              <w:t>{{#IF_showOperatorPhone}}</w:t>
             </w:r>
             <w:r>
               <w:rPr>
@@ -964,43 +924,55 @@
                 <w:sz w:val="24"/>
                 <w:szCs w:val="24"/>
               </w:rPr>
-              <w:t>Phone: {{operatorPhone</w:t>
-            </w:r>
-            <w:proofErr w:type="gramStart"/>
-            <w:r>
-              <w:rPr>
-                <w:rFonts w:ascii="BC Sans" w:eastAsia="BC Sans" w:hAnsi="BC Sans" w:cs="BC Sans"/>
-                <w:sz w:val="24"/>
-                <w:szCs w:val="24"/>
-              </w:rPr>
-              <w:t>}}{</w:t>
-            </w:r>
-            <w:proofErr w:type="gramEnd"/>
-            <w:r>
-              <w:rPr>
-                <w:rFonts w:ascii="BC Sans" w:eastAsia="BC Sans" w:hAnsi="BC Sans" w:cs="BC Sans"/>
-                <w:sz w:val="24"/>
-                <w:szCs w:val="24"/>
-              </w:rPr>
-              <w:t>{/IF_showOperatorPhone</w:t>
-            </w:r>
-            <w:proofErr w:type="gramStart"/>
-            <w:r>
-              <w:rPr>
-                <w:rFonts w:ascii="BC Sans" w:eastAsia="BC Sans" w:hAnsi="BC Sans" w:cs="BC Sans"/>
-                <w:sz w:val="24"/>
-                <w:szCs w:val="24"/>
-              </w:rPr>
-              <w:t>}}{</w:t>
-            </w:r>
-            <w:proofErr w:type="gramEnd"/>
-            <w:r>
-              <w:rPr>
-                <w:rFonts w:ascii="BC Sans" w:eastAsia="BC Sans" w:hAnsi="BC Sans" w:cs="BC Sans"/>
-                <w:sz w:val="24"/>
-                <w:szCs w:val="24"/>
-              </w:rPr>
-              <w:t>{#IF_showOperatorMobile}}</w:t>
+              <w:t>Phone:</w:t>
+            </w:r>
+            <w:r>
+              <w:rPr>
+                <w:rFonts w:ascii="BC Sans" w:eastAsia="BC Sans" w:hAnsi="BC Sans" w:cs="BC Sans"/>
+                <w:sz w:val="24"/>
+                <w:szCs w:val="24"/>
+              </w:rPr>
+              <w:t xml:space="preserve"> </w:t>
+            </w:r>
+            <w:r>
+              <w:rPr>
+                <w:rFonts w:ascii="BC Sans" w:eastAsia="BC Sans" w:hAnsi="BC Sans" w:cs="BC Sans"/>
+                <w:sz w:val="24"/>
+                <w:szCs w:val="24"/>
+              </w:rPr>
+              <w:t>{{operatorPhone}}{{/IF_</w:t>
+            </w:r>
+            <w:r>
+              <w:rPr>
+                <w:rFonts w:ascii="BC Sans" w:eastAsia="BC Sans" w:hAnsi="BC Sans" w:cs="BC Sans"/>
+                <w:sz w:val="24"/>
+                <w:szCs w:val="24"/>
+              </w:rPr>
+              <w:t>showOperatorPhone</w:t>
+            </w:r>
+            <w:r>
+              <w:rPr>
+                <w:rFonts w:ascii="BC Sans" w:eastAsia="BC Sans" w:hAnsi="BC Sans" w:cs="BC Sans"/>
+                <w:sz w:val="24"/>
+                <w:szCs w:val="24"/>
+              </w:rPr>
+              <w:t>}}{{#IF_</w:t>
+            </w:r>
+            <w:r>
+              <w:rPr>
+                <w:rFonts w:ascii="BC Sans" w:eastAsia="BC Sans" w:hAnsi="BC Sans" w:cs="BC Sans"/>
+                <w:sz w:val="24"/>
+                <w:szCs w:val="24"/>
+              </w:rPr>
+              <w:t>showOperatorMobile</w:t>
+            </w:r>
+            <w:r>
+              <w:rPr>
+                <w:rFonts w:ascii="BC Sans" w:eastAsia="BC Sans" w:hAnsi="BC Sans" w:cs="BC Sans"/>
+                <w:sz w:val="24"/>
+                <w:szCs w:val="24"/>
+              </w:rPr>
+              <w:t>}}</w:t>
             </w:r>
             <w:r>
               <w:rPr>
@@ -1009,14 +981,23 @@
                 <w:szCs w:val="24"/>
               </w:rPr>
               <w:br/>
-            </w:r>
-            <w:r>
-              <w:rPr>
-                <w:rFonts w:ascii="BC Sans" w:eastAsia="BC Sans" w:hAnsi="BC Sans" w:cs="BC Sans"/>
-                <w:sz w:val="24"/>
-                <w:szCs w:val="24"/>
-              </w:rPr>
-              <w:t>Mobile: {{</w:t>
+              <w:t>Mobile:</w:t>
+            </w:r>
+            <w:r>
+              <w:rPr>
+                <w:rFonts w:ascii="BC Sans" w:eastAsia="BC Sans" w:hAnsi="BC Sans" w:cs="BC Sans"/>
+                <w:sz w:val="24"/>
+                <w:szCs w:val="24"/>
+              </w:rPr>
+              <w:t xml:space="preserve"> </w:t>
+            </w:r>
+            <w:r>
+              <w:rPr>
+                <w:rFonts w:ascii="BC Sans" w:eastAsia="BC Sans" w:hAnsi="BC Sans" w:cs="BC Sans"/>
+                <w:sz w:val="24"/>
+                <w:szCs w:val="24"/>
+              </w:rPr>
+              <w:t>{{</w:t>
             </w:r>
             <w:proofErr w:type="spellStart"/>
             <w:r>
@@ -1028,23 +1009,13 @@
               <w:t>operatorMobile</w:t>
             </w:r>
             <w:proofErr w:type="spellEnd"/>
-            <w:proofErr w:type="gramStart"/>
-            <w:r>
-              <w:rPr>
-                <w:rFonts w:ascii="BC Sans" w:eastAsia="BC Sans" w:hAnsi="BC Sans" w:cs="BC Sans"/>
-                <w:sz w:val="24"/>
-                <w:szCs w:val="24"/>
-              </w:rPr>
-              <w:t>}}{</w:t>
-            </w:r>
-            <w:proofErr w:type="gramEnd"/>
-            <w:r>
-              <w:rPr>
-                <w:rFonts w:ascii="BC Sans" w:eastAsia="BC Sans" w:hAnsi="BC Sans" w:cs="BC Sans"/>
-                <w:sz w:val="24"/>
-                <w:szCs w:val="24"/>
-              </w:rPr>
-              <w:t>{/</w:t>
+            <w:r>
+              <w:rPr>
+                <w:rFonts w:ascii="BC Sans" w:eastAsia="BC Sans" w:hAnsi="BC Sans" w:cs="BC Sans"/>
+                <w:sz w:val="24"/>
+                <w:szCs w:val="24"/>
+              </w:rPr>
+              <w:t>}}{{/</w:t>
             </w:r>
             <w:proofErr w:type="spellStart"/>
             <w:r>
@@ -1053,7 +1024,15 @@
                 <w:sz w:val="24"/>
                 <w:szCs w:val="24"/>
               </w:rPr>
-              <w:t>IF_showOperatorMobile</w:t>
+              <w:t>IF_</w:t>
+            </w:r>
+            <w:r>
+              <w:rPr>
+                <w:rFonts w:ascii="BC Sans" w:eastAsia="BC Sans" w:hAnsi="BC Sans" w:cs="BC Sans"/>
+                <w:sz w:val="24"/>
+                <w:szCs w:val="24"/>
+              </w:rPr>
+              <w:t>showOperatorMobile</w:t>
             </w:r>
             <w:proofErr w:type="spellEnd"/>
             <w:r>
@@ -1091,20 +1070,7 @@
                 <w:szCs w:val="24"/>
                 <w:lang w:val="en-US"/>
               </w:rPr>
-              <w:t xml:space="preserve">Follow-up </w:t>
-            </w:r>
-            <w:proofErr w:type="gramStart"/>
-            <w:r>
-              <w:rPr>
-                <w:rFonts w:ascii="BC Sans" w:eastAsia="BC Sans" w:hAnsi="BC Sans" w:cs="BC Sans"/>
-                <w:b/>
-                <w:bCs/>
-                <w:color w:val="1A1A2E"/>
-                <w:sz w:val="24"/>
-                <w:szCs w:val="24"/>
-                <w:lang w:val="en-US"/>
-              </w:rPr>
-              <w:t xml:space="preserve">Required: </w:t>
+              <w:t xml:space="preserve">Follow-up Required: </w:t>
             </w:r>
             <w:r>
               <w:rPr>
@@ -1127,7 +1093,6 @@
               <w:t>{</w:t>
             </w:r>
             <w:proofErr w:type="spellStart"/>
-            <w:proofErr w:type="gramEnd"/>
             <w:r>
               <w:rPr>
                 <w:rFonts w:ascii="BC Sans" w:eastAsia="BC Sans" w:hAnsi="BC Sans" w:cs="BC Sans"/>
@@ -1278,6 +1243,7 @@
           <w:szCs w:val="24"/>
           <w:lang w:val="en-CA"/>
         </w:rPr>
+        <w:lastRenderedPageBreak/>
         <w:t>{{#IF_showOpeningComments}}</w:t>
       </w:r>
       <w:r>
@@ -1347,7 +1313,6 @@
         <w:t>openingComments</w:t>
       </w:r>
       <w:proofErr w:type="spellEnd"/>
-      <w:proofErr w:type="gramStart"/>
       <w:r>
         <w:rPr>
           <w:rFonts w:ascii="BC Sans" w:hAnsi="BC Sans"/>
@@ -1356,18 +1321,7 @@
           <w:szCs w:val="24"/>
           <w:lang w:val="en-CA"/>
         </w:rPr>
-        <w:t>}}{</w:t>
-      </w:r>
-      <w:proofErr w:type="gramEnd"/>
-      <w:r>
-        <w:rPr>
-          <w:rFonts w:ascii="BC Sans" w:hAnsi="BC Sans"/>
-          <w:color w:val="000000" w:themeColor="text1"/>
-          <w:sz w:val="24"/>
-          <w:szCs w:val="24"/>
-          <w:lang w:val="en-CA"/>
-        </w:rPr>
-        <w:t>{/</w:t>
+        <w:t>}}{{/</w:t>
       </w:r>
       <w:proofErr w:type="spellStart"/>
       <w:r>
@@ -1381,7 +1335,6 @@
         <w:t>IF_showOpeningComments</w:t>
       </w:r>
       <w:proofErr w:type="spellEnd"/>
-      <w:proofErr w:type="gramStart"/>
       <w:r>
         <w:rPr>
           <w:rFonts w:ascii="BC Sans" w:hAnsi="BC Sans"/>
@@ -1399,17 +1352,7 @@
           <w:sz w:val="24"/>
           <w:szCs w:val="24"/>
         </w:rPr>
-        <w:t>{</w:t>
-      </w:r>
-      <w:proofErr w:type="gramEnd"/>
-      <w:r>
-        <w:rPr>
-          <w:rFonts w:ascii="BC Sans" w:hAnsi="BC Sans"/>
-          <w:color w:val="000000" w:themeColor="text1"/>
-          <w:sz w:val="24"/>
-          <w:szCs w:val="24"/>
-        </w:rPr>
-        <w:t>{#InspectionFindings}}</w:t>
+        <w:t>{{#InspectionFindings}}</w:t>
       </w:r>
     </w:p>
     <w:p>
@@ -1424,7 +1367,6 @@
         </w:rPr>
       </w:pPr>
       <w:r>
-        <w:lastRenderedPageBreak/>
         <w:br/>
       </w:r>
       <w:r>
@@ -1502,33 +1444,7 @@
                 <w:szCs w:val="24"/>
                 <w:lang w:val="en-CA"/>
               </w:rPr>
-              <w:t>{{#findings</w:t>
-            </w:r>
-            <w:proofErr w:type="gramStart"/>
-            <w:r>
-              <w:rPr>
-                <w:rFonts w:ascii="BC Sans" w:eastAsia="BC Sans" w:hAnsi="BC Sans" w:cs="BC Sans"/>
-                <w:b/>
-                <w:bCs/>
-                <w:color w:val="FFFFFF" w:themeColor="background1"/>
-                <w:sz w:val="24"/>
-                <w:szCs w:val="24"/>
-                <w:lang w:val="en-CA"/>
-              </w:rPr>
-              <w:t>}}{</w:t>
-            </w:r>
-            <w:proofErr w:type="gramEnd"/>
-            <w:r>
-              <w:rPr>
-                <w:rFonts w:ascii="BC Sans" w:eastAsia="BC Sans" w:hAnsi="BC Sans" w:cs="BC Sans"/>
-                <w:b/>
-                <w:bCs/>
-                <w:color w:val="FFFFFF" w:themeColor="background1"/>
-                <w:sz w:val="24"/>
-                <w:szCs w:val="24"/>
-                <w:lang w:val="en-CA"/>
-              </w:rPr>
-              <w:t>{categoryName}}</w:t>
+              <w:t>{{#findings}}{{categoryName}}</w:t>
             </w:r>
           </w:p>
         </w:tc>
@@ -1588,47 +1504,7 @@
                 <w:szCs w:val="24"/>
                 <w:lang w:val="en-CA"/>
               </w:rPr>
-              <w:t>{{#questions</w:t>
-            </w:r>
-            <w:proofErr w:type="gramStart"/>
-            <w:r>
-              <w:rPr>
-                <w:rFonts w:ascii="BC Sans" w:eastAsia="BC Sans" w:hAnsi="BC Sans" w:cs="BC Sans"/>
-                <w:sz w:val="24"/>
-                <w:szCs w:val="24"/>
-                <w:lang w:val="en-CA"/>
-              </w:rPr>
-              <w:t>}}{</w:t>
-            </w:r>
-            <w:proofErr w:type="gramEnd"/>
-            <w:r>
-              <w:rPr>
-                <w:rFonts w:ascii="BC Sans" w:eastAsia="BC Sans" w:hAnsi="BC Sans" w:cs="BC Sans"/>
-                <w:sz w:val="24"/>
-                <w:szCs w:val="24"/>
-                <w:lang w:val="en-CA"/>
-              </w:rPr>
-              <w:t>{question</w:t>
-            </w:r>
-            <w:proofErr w:type="gramStart"/>
-            <w:r>
-              <w:rPr>
-                <w:rFonts w:ascii="BC Sans" w:eastAsia="BC Sans" w:hAnsi="BC Sans" w:cs="BC Sans"/>
-                <w:sz w:val="24"/>
-                <w:szCs w:val="24"/>
-                <w:lang w:val="en-CA"/>
-              </w:rPr>
-              <w:t>}}{</w:t>
-            </w:r>
-            <w:proofErr w:type="gramEnd"/>
-            <w:r>
-              <w:rPr>
-                <w:rFonts w:ascii="BC Sans" w:eastAsia="BC Sans" w:hAnsi="BC Sans" w:cs="BC Sans"/>
-                <w:sz w:val="24"/>
-                <w:szCs w:val="24"/>
-                <w:lang w:val="en-CA"/>
-              </w:rPr>
-              <w:t>{#IF_showObservations}}</w:t>
+              <w:t>{{#questions}}{{question}}{{#IF_showObservations}}</w:t>
             </w:r>
           </w:p>
           <w:p>
@@ -1693,76 +1569,16 @@
                 <w:szCs w:val="24"/>
                 <w:lang w:val="en-CA"/>
               </w:rPr>
-              <w:t>{</w:t>
-            </w:r>
-            <w:proofErr w:type="gramStart"/>
-            <w:r>
-              <w:rPr>
-                <w:rFonts w:ascii="BC Sans" w:eastAsia="BC Sans" w:hAnsi="BC Sans" w:cs="BC Sans"/>
-                <w:sz w:val="24"/>
-                <w:szCs w:val="24"/>
-                <w:lang w:val="en-CA"/>
-              </w:rPr>
-              <w:t>{.}}{</w:t>
-            </w:r>
-            <w:proofErr w:type="gramEnd"/>
-            <w:r>
-              <w:rPr>
-                <w:rFonts w:ascii="BC Sans" w:eastAsia="BC Sans" w:hAnsi="BC Sans" w:cs="BC Sans"/>
-                <w:sz w:val="24"/>
-                <w:szCs w:val="24"/>
-                <w:lang w:val="en-CA"/>
-              </w:rPr>
-              <w:t>{/cannedComments</w:t>
-            </w:r>
-            <w:proofErr w:type="gramStart"/>
-            <w:r>
-              <w:rPr>
-                <w:rFonts w:ascii="BC Sans" w:eastAsia="BC Sans" w:hAnsi="BC Sans" w:cs="BC Sans"/>
-                <w:sz w:val="24"/>
-                <w:szCs w:val="24"/>
-                <w:lang w:val="en-CA"/>
-              </w:rPr>
-              <w:t>}}</w:t>
-            </w:r>
-            <w:r>
-              <w:rPr>
-                <w:rFonts w:ascii="BC Sans" w:eastAsia="BC Sans" w:hAnsi="BC Sans" w:cs="BC Sans"/>
-                <w:sz w:val="24"/>
-                <w:szCs w:val="24"/>
-                <w:lang w:val="en-CA"/>
-              </w:rPr>
-              <w:t>{</w:t>
-            </w:r>
-            <w:proofErr w:type="gramEnd"/>
-            <w:r>
-              <w:rPr>
-                <w:rFonts w:ascii="BC Sans" w:eastAsia="BC Sans" w:hAnsi="BC Sans" w:cs="BC Sans"/>
-                <w:sz w:val="24"/>
-                <w:szCs w:val="24"/>
-                <w:lang w:val="en-CA"/>
-              </w:rPr>
-              <w:t>{/IF_showObservations</w:t>
-            </w:r>
-            <w:proofErr w:type="gramStart"/>
-            <w:r>
-              <w:rPr>
-                <w:rFonts w:ascii="BC Sans" w:eastAsia="BC Sans" w:hAnsi="BC Sans" w:cs="BC Sans"/>
-                <w:sz w:val="24"/>
-                <w:szCs w:val="24"/>
-                <w:lang w:val="en-CA"/>
-              </w:rPr>
-              <w:t>}}{</w:t>
-            </w:r>
-            <w:proofErr w:type="gramEnd"/>
-            <w:r>
-              <w:rPr>
-                <w:rFonts w:ascii="BC Sans" w:eastAsia="BC Sans" w:hAnsi="BC Sans" w:cs="BC Sans"/>
-                <w:sz w:val="24"/>
-                <w:szCs w:val="24"/>
-                <w:lang w:val="en-CA"/>
-              </w:rPr>
-              <w:t>{#IF_showComments}}</w:t>
+              <w:t>{{.}}{{/cannedComments}}</w:t>
+            </w:r>
+            <w:r>
+              <w:rPr>
+                <w:rFonts w:ascii="BC Sans" w:eastAsia="BC Sans" w:hAnsi="BC Sans" w:cs="BC Sans"/>
+                <w:sz w:val="24"/>
+                <w:szCs w:val="24"/>
+                <w:lang w:val="en-CA"/>
+              </w:rPr>
+              <w:t>{{/IF_showObservations}}{{#IF_showComments}}</w:t>
             </w:r>
           </w:p>
           <w:p>
@@ -1793,27 +1609,7 @@
                 <w:szCs w:val="24"/>
                 <w:lang w:val="en-CA"/>
               </w:rPr>
-              <w:t xml:space="preserve"> {{comments</w:t>
-            </w:r>
-            <w:proofErr w:type="gramStart"/>
-            <w:r>
-              <w:rPr>
-                <w:rFonts w:ascii="BC Sans" w:eastAsia="BC Sans" w:hAnsi="BC Sans" w:cs="BC Sans"/>
-                <w:sz w:val="24"/>
-                <w:szCs w:val="24"/>
-                <w:lang w:val="en-CA"/>
-              </w:rPr>
-              <w:t>}}{</w:t>
-            </w:r>
-            <w:proofErr w:type="gramEnd"/>
-            <w:r>
-              <w:rPr>
-                <w:rFonts w:ascii="BC Sans" w:eastAsia="BC Sans" w:hAnsi="BC Sans" w:cs="BC Sans"/>
-                <w:sz w:val="24"/>
-                <w:szCs w:val="24"/>
-                <w:lang w:val="en-CA"/>
-              </w:rPr>
-              <w:t>{/</w:t>
+              <w:t xml:space="preserve"> {{comments}}{{/</w:t>
             </w:r>
             <w:proofErr w:type="spellStart"/>
             <w:r>
@@ -1826,7 +1622,6 @@
               <w:t>IF_showComments</w:t>
             </w:r>
             <w:proofErr w:type="spellEnd"/>
-            <w:proofErr w:type="gramStart"/>
             <w:r>
               <w:rPr>
                 <w:rFonts w:ascii="BC Sans" w:eastAsia="BC Sans" w:hAnsi="BC Sans" w:cs="BC Sans"/>
@@ -1843,17 +1638,7 @@
                 <w:szCs w:val="18"/>
                 <w:lang w:val="en-CA"/>
               </w:rPr>
-              <w:t>{</w:t>
-            </w:r>
-            <w:proofErr w:type="gramEnd"/>
-            <w:r>
-              <w:rPr>
-                <w:rFonts w:ascii="BC Sans" w:eastAsia="BC Sans" w:hAnsi="BC Sans" w:cs="BC Sans"/>
-                <w:sz w:val="18"/>
-                <w:szCs w:val="18"/>
-                <w:lang w:val="en-CA"/>
-              </w:rPr>
-              <w:t>{#IF_showAction}}</w:t>
+              <w:t>{{#IF_showAction}}</w:t>
             </w:r>
           </w:p>
           <w:p>
@@ -1906,25 +1691,14 @@
               <w:t>correctiveAction</w:t>
             </w:r>
             <w:proofErr w:type="spellEnd"/>
-            <w:proofErr w:type="gramStart"/>
-            <w:r>
-              <w:rPr>
-                <w:rFonts w:ascii="BC Sans" w:eastAsia="BC Sans" w:hAnsi="BC Sans" w:cs="BC Sans"/>
-                <w:sz w:val="24"/>
-                <w:szCs w:val="24"/>
-                <w:lang w:val="en-CA"/>
-              </w:rPr>
-              <w:t>}}{</w:t>
-            </w:r>
-            <w:proofErr w:type="gramEnd"/>
-            <w:r>
-              <w:rPr>
-                <w:rFonts w:ascii="BC Sans" w:eastAsia="BC Sans" w:hAnsi="BC Sans" w:cs="BC Sans"/>
-                <w:sz w:val="24"/>
-                <w:szCs w:val="24"/>
-                <w:lang w:val="en-CA"/>
-              </w:rPr>
-              <w:t>{/</w:t>
+            <w:r>
+              <w:rPr>
+                <w:rFonts w:ascii="BC Sans" w:eastAsia="BC Sans" w:hAnsi="BC Sans" w:cs="BC Sans"/>
+                <w:sz w:val="24"/>
+                <w:szCs w:val="24"/>
+                <w:lang w:val="en-CA"/>
+              </w:rPr>
+              <w:t>}}{{/</w:t>
             </w:r>
             <w:proofErr w:type="spellStart"/>
             <w:r>
@@ -1987,7 +1761,6 @@
               </w:rPr>
               <w:t>{{#IF_statusRed</w:t>
             </w:r>
-            <w:proofErr w:type="gramStart"/>
             <w:r>
               <w:rPr>
                 <w:rFonts w:ascii="BC Sans" w:eastAsia="BC Sans" w:hAnsi="BC Sans" w:cs="BC Sans"/>
@@ -1998,9 +1771,60 @@
                 <w:szCs w:val="24"/>
                 <w:lang w:val="en-CA"/>
               </w:rPr>
-              <w:t>}}{</w:t>
-            </w:r>
-            <w:proofErr w:type="gramEnd"/>
+              <w:t>}}{{complianceStatus}}{{/</w:t>
+            </w:r>
+            <w:r>
+              <w:rPr>
+                <w:rFonts w:ascii="BC Sans" w:eastAsia="BC Sans" w:hAnsi="BC Sans" w:cs="BC Sans"/>
+                <w:color w:val="ED0000"/>
+                <w:sz w:val="24"/>
+                <w:szCs w:val="24"/>
+                <w:lang w:val="en-CA"/>
+              </w:rPr>
+              <w:t>IF_statusRed}}</w:t>
+            </w:r>
+            <w:r>
+              <w:rPr>
+                <w:rFonts w:ascii="BC Sans" w:eastAsia="BC Sans" w:hAnsi="BC Sans" w:cs="BC Sans"/>
+                <w:color w:val="1A1A2E"/>
+                <w:sz w:val="24"/>
+                <w:szCs w:val="24"/>
+                <w:lang w:val="en-CA"/>
+              </w:rPr>
+              <w:t>{{#IF_statusNormal</w:t>
+            </w:r>
+            <w:r>
+              <w:rPr>
+                <w:rFonts w:ascii="BC Sans" w:eastAsia="BC Sans" w:hAnsi="BC Sans" w:cs="BC Sans"/>
+                <w:b/>
+                <w:bCs/>
+                <w:color w:val="1A1A2E"/>
+                <w:sz w:val="24"/>
+                <w:szCs w:val="24"/>
+                <w:lang w:val="en-CA"/>
+              </w:rPr>
+              <w:t>}}{{complianceStatus}}</w:t>
+            </w:r>
+            <w:r>
+              <w:rPr>
+                <w:rFonts w:ascii="BC Sans" w:eastAsia="BC Sans" w:hAnsi="BC Sans" w:cs="BC Sans"/>
+                <w:color w:val="1A1A2E"/>
+                <w:sz w:val="24"/>
+                <w:szCs w:val="24"/>
+                <w:lang w:val="en-CA"/>
+              </w:rPr>
+              <w:t>{{/IF_statusNormal}}</w:t>
+            </w:r>
+            <w:r>
+              <w:rPr>
+                <w:rFonts w:ascii="BC Sans" w:eastAsia="BC Sans" w:hAnsi="BC Sans" w:cs="BC Sans"/>
+                <w:color w:val="1A1A2E"/>
+                <w:sz w:val="24"/>
+                <w:szCs w:val="24"/>
+                <w:lang w:val="en-CA"/>
+              </w:rPr>
+              <w:t>{{#IF_showCDI}}</w:t>
+            </w:r>
             <w:r>
               <w:rPr>
                 <w:rFonts w:ascii="BC Sans" w:eastAsia="BC Sans" w:hAnsi="BC Sans" w:cs="BC Sans"/>
@@ -2011,192 +1835,8 @@
                 <w:szCs w:val="24"/>
                 <w:lang w:val="en-CA"/>
               </w:rPr>
-              <w:t>{complianceStatus</w:t>
-            </w:r>
-            <w:proofErr w:type="gramStart"/>
-            <w:r>
-              <w:rPr>
-                <w:rFonts w:ascii="BC Sans" w:eastAsia="BC Sans" w:hAnsi="BC Sans" w:cs="BC Sans"/>
-                <w:b/>
-                <w:bCs/>
-                <w:color w:val="ED0000"/>
-                <w:sz w:val="24"/>
-                <w:szCs w:val="24"/>
-                <w:lang w:val="en-CA"/>
-              </w:rPr>
-              <w:t>}}{</w:t>
-            </w:r>
-            <w:proofErr w:type="gramEnd"/>
-            <w:r>
-              <w:rPr>
-                <w:rFonts w:ascii="BC Sans" w:eastAsia="BC Sans" w:hAnsi="BC Sans" w:cs="BC Sans"/>
-                <w:b/>
-                <w:bCs/>
-                <w:color w:val="ED0000"/>
-                <w:sz w:val="24"/>
-                <w:szCs w:val="24"/>
-                <w:lang w:val="en-CA"/>
-              </w:rPr>
-              <w:t>{/</w:t>
-            </w:r>
-            <w:r>
-              <w:rPr>
-                <w:rFonts w:ascii="BC Sans" w:eastAsia="BC Sans" w:hAnsi="BC Sans" w:cs="BC Sans"/>
-                <w:color w:val="ED0000"/>
-                <w:sz w:val="24"/>
-                <w:szCs w:val="24"/>
-                <w:lang w:val="en-CA"/>
-              </w:rPr>
-              <w:t>IF_statusRed</w:t>
-            </w:r>
-            <w:proofErr w:type="gramStart"/>
-            <w:r>
-              <w:rPr>
-                <w:rFonts w:ascii="BC Sans" w:eastAsia="BC Sans" w:hAnsi="BC Sans" w:cs="BC Sans"/>
-                <w:color w:val="ED0000"/>
-                <w:sz w:val="24"/>
-                <w:szCs w:val="24"/>
-                <w:lang w:val="en-CA"/>
-              </w:rPr>
-              <w:t>}}</w:t>
-            </w:r>
-            <w:r>
-              <w:rPr>
-                <w:rFonts w:ascii="BC Sans" w:eastAsia="BC Sans" w:hAnsi="BC Sans" w:cs="BC Sans"/>
-                <w:color w:val="1A1A2E"/>
-                <w:sz w:val="24"/>
-                <w:szCs w:val="24"/>
-                <w:lang w:val="en-CA"/>
-              </w:rPr>
-              <w:t>{</w:t>
-            </w:r>
-            <w:proofErr w:type="gramEnd"/>
-            <w:r>
-              <w:rPr>
-                <w:rFonts w:ascii="BC Sans" w:eastAsia="BC Sans" w:hAnsi="BC Sans" w:cs="BC Sans"/>
-                <w:color w:val="1A1A2E"/>
-                <w:sz w:val="24"/>
-                <w:szCs w:val="24"/>
-                <w:lang w:val="en-CA"/>
-              </w:rPr>
-              <w:t>{#IF_statusNormal</w:t>
-            </w:r>
-            <w:proofErr w:type="gramStart"/>
-            <w:r>
-              <w:rPr>
-                <w:rFonts w:ascii="BC Sans" w:eastAsia="BC Sans" w:hAnsi="BC Sans" w:cs="BC Sans"/>
-                <w:b/>
-                <w:bCs/>
-                <w:color w:val="1A1A2E"/>
-                <w:sz w:val="24"/>
-                <w:szCs w:val="24"/>
-                <w:lang w:val="en-CA"/>
-              </w:rPr>
-              <w:t>}}{</w:t>
-            </w:r>
-            <w:proofErr w:type="gramEnd"/>
-            <w:r>
-              <w:rPr>
-                <w:rFonts w:ascii="BC Sans" w:eastAsia="BC Sans" w:hAnsi="BC Sans" w:cs="BC Sans"/>
-                <w:b/>
-                <w:bCs/>
-                <w:color w:val="1A1A2E"/>
-                <w:sz w:val="24"/>
-                <w:szCs w:val="24"/>
-                <w:lang w:val="en-CA"/>
-              </w:rPr>
-              <w:t>{complianceStatus</w:t>
-            </w:r>
-            <w:proofErr w:type="gramStart"/>
-            <w:r>
-              <w:rPr>
-                <w:rFonts w:ascii="BC Sans" w:eastAsia="BC Sans" w:hAnsi="BC Sans" w:cs="BC Sans"/>
-                <w:b/>
-                <w:bCs/>
-                <w:color w:val="1A1A2E"/>
-                <w:sz w:val="24"/>
-                <w:szCs w:val="24"/>
-                <w:lang w:val="en-CA"/>
-              </w:rPr>
-              <w:t>}}</w:t>
-            </w:r>
-            <w:r>
-              <w:rPr>
-                <w:rFonts w:ascii="BC Sans" w:eastAsia="BC Sans" w:hAnsi="BC Sans" w:cs="BC Sans"/>
-                <w:color w:val="1A1A2E"/>
-                <w:sz w:val="24"/>
-                <w:szCs w:val="24"/>
-                <w:lang w:val="en-CA"/>
-              </w:rPr>
-              <w:t>{</w:t>
-            </w:r>
-            <w:proofErr w:type="gramEnd"/>
-            <w:r>
-              <w:rPr>
-                <w:rFonts w:ascii="BC Sans" w:eastAsia="BC Sans" w:hAnsi="BC Sans" w:cs="BC Sans"/>
-                <w:color w:val="1A1A2E"/>
-                <w:sz w:val="24"/>
-                <w:szCs w:val="24"/>
-                <w:lang w:val="en-CA"/>
-              </w:rPr>
-              <w:t>{/IF_statusNormal</w:t>
-            </w:r>
-            <w:proofErr w:type="gramStart"/>
-            <w:r>
-              <w:rPr>
-                <w:rFonts w:ascii="BC Sans" w:eastAsia="BC Sans" w:hAnsi="BC Sans" w:cs="BC Sans"/>
-                <w:color w:val="1A1A2E"/>
-                <w:sz w:val="24"/>
-                <w:szCs w:val="24"/>
-                <w:lang w:val="en-CA"/>
-              </w:rPr>
-              <w:t>}}</w:t>
-            </w:r>
-            <w:r>
-              <w:rPr>
-                <w:rFonts w:ascii="BC Sans" w:eastAsia="BC Sans" w:hAnsi="BC Sans" w:cs="BC Sans"/>
-                <w:color w:val="1A1A2E"/>
-                <w:sz w:val="24"/>
-                <w:szCs w:val="24"/>
-                <w:lang w:val="en-CA"/>
-              </w:rPr>
-              <w:t>{</w:t>
-            </w:r>
-            <w:proofErr w:type="gramEnd"/>
-            <w:r>
-              <w:rPr>
-                <w:rFonts w:ascii="BC Sans" w:eastAsia="BC Sans" w:hAnsi="BC Sans" w:cs="BC Sans"/>
-                <w:color w:val="1A1A2E"/>
-                <w:sz w:val="24"/>
-                <w:szCs w:val="24"/>
-                <w:lang w:val="en-CA"/>
-              </w:rPr>
-              <w:t>{#IF_showCDI</w:t>
-            </w:r>
-            <w:proofErr w:type="gramStart"/>
-            <w:r>
-              <w:rPr>
-                <w:rFonts w:ascii="BC Sans" w:eastAsia="BC Sans" w:hAnsi="BC Sans" w:cs="BC Sans"/>
-                <w:color w:val="1A1A2E"/>
-                <w:sz w:val="24"/>
-                <w:szCs w:val="24"/>
-                <w:lang w:val="en-CA"/>
-              </w:rPr>
-              <w:t>}}</w:t>
-            </w:r>
-            <w:r>
-              <w:rPr>
-                <w:rFonts w:ascii="BC Sans" w:eastAsia="BC Sans" w:hAnsi="BC Sans" w:cs="BC Sans"/>
-                <w:b/>
-                <w:bCs/>
-                <w:color w:val="ED0000"/>
-                <w:sz w:val="24"/>
-                <w:szCs w:val="24"/>
-                <w:lang w:val="en-CA"/>
-              </w:rPr>
               <w:t>Corrected</w:t>
             </w:r>
-            <w:proofErr w:type="gramEnd"/>
             <w:r>
               <w:rPr>
                 <w:rFonts w:ascii="Courier New" w:eastAsia="Times New Roman" w:hAnsi="Courier New" w:cs="Courier New"/>
@@ -2253,27 +1893,15 @@
               <w:t>IF_showCDI</w:t>
             </w:r>
             <w:proofErr w:type="spellEnd"/>
-            <w:proofErr w:type="gramStart"/>
-            <w:r>
-              <w:rPr>
-                <w:rFonts w:ascii="BC Sans" w:eastAsia="BC Sans" w:hAnsi="BC Sans" w:cs="BC Sans"/>
-                <w:color w:val="1A1A2E"/>
-                <w:sz w:val="24"/>
-                <w:szCs w:val="24"/>
-                <w:lang w:val="en-CA"/>
-              </w:rPr>
-              <w:t>}}{</w:t>
-            </w:r>
-            <w:proofErr w:type="gramEnd"/>
-            <w:r>
-              <w:rPr>
-                <w:rFonts w:ascii="BC Sans" w:eastAsia="BC Sans" w:hAnsi="BC Sans" w:cs="BC Sans"/>
-                <w:color w:val="1A1A2E"/>
-                <w:sz w:val="24"/>
-                <w:szCs w:val="24"/>
-                <w:lang w:val="en-CA"/>
-              </w:rPr>
-              <w:t>{#IF_showDueDate}}</w:t>
+            <w:r>
+              <w:rPr>
+                <w:rFonts w:ascii="BC Sans" w:eastAsia="BC Sans" w:hAnsi="BC Sans" w:cs="BC Sans"/>
+                <w:color w:val="1A1A2E"/>
+                <w:sz w:val="24"/>
+                <w:szCs w:val="24"/>
+                <w:lang w:val="en-CA"/>
+              </w:rPr>
+              <w:t>}}{{#IF_showDueDate}}</w:t>
             </w:r>
             <w:r>
               <w:rPr>
@@ -2325,93 +1953,27 @@
                 <w:szCs w:val="24"/>
                 <w:lang w:val="en-CA"/>
               </w:rPr>
-              <w:t>{{complianceDueDate</w:t>
-            </w:r>
-            <w:proofErr w:type="gramStart"/>
-            <w:r>
-              <w:rPr>
-                <w:rFonts w:ascii="BC Sans" w:eastAsia="BC Sans" w:hAnsi="BC Sans" w:cs="BC Sans"/>
-                <w:color w:val="1A1A2E"/>
-                <w:sz w:val="24"/>
-                <w:szCs w:val="24"/>
-                <w:lang w:val="en-CA"/>
-              </w:rPr>
-              <w:t>}}</w:t>
-            </w:r>
-            <w:r>
-              <w:rPr>
-                <w:rFonts w:ascii="BC Sans" w:eastAsia="BC Sans" w:hAnsi="BC Sans" w:cs="BC Sans"/>
-                <w:color w:val="1A1A2E"/>
-                <w:sz w:val="24"/>
-                <w:szCs w:val="24"/>
-                <w:lang w:val="en-CA"/>
-              </w:rPr>
-              <w:t>{</w:t>
-            </w:r>
-            <w:proofErr w:type="gramEnd"/>
-            <w:r>
-              <w:rPr>
-                <w:rFonts w:ascii="BC Sans" w:eastAsia="BC Sans" w:hAnsi="BC Sans" w:cs="BC Sans"/>
-                <w:color w:val="1A1A2E"/>
-                <w:sz w:val="24"/>
-                <w:szCs w:val="24"/>
-                <w:lang w:val="en-CA"/>
-              </w:rPr>
-              <w:t>{/IF_showDueDate</w:t>
-            </w:r>
-            <w:proofErr w:type="gramStart"/>
-            <w:r>
-              <w:rPr>
-                <w:rFonts w:ascii="BC Sans" w:eastAsia="BC Sans" w:hAnsi="BC Sans" w:cs="BC Sans"/>
-                <w:color w:val="1A1A2E"/>
-                <w:sz w:val="24"/>
-                <w:szCs w:val="24"/>
-                <w:lang w:val="en-CA"/>
-              </w:rPr>
-              <w:t>}}</w:t>
-            </w:r>
-            <w:r>
-              <w:rPr>
-                <w:rFonts w:ascii="BC Sans" w:eastAsia="BC Sans" w:hAnsi="BC Sans" w:cs="BC Sans"/>
-                <w:color w:val="1A1A2E"/>
-                <w:sz w:val="24"/>
-                <w:szCs w:val="24"/>
-                <w:lang w:val="en-CA"/>
-              </w:rPr>
-              <w:t>{</w:t>
-            </w:r>
-            <w:proofErr w:type="gramEnd"/>
-            <w:r>
-              <w:rPr>
-                <w:rFonts w:ascii="BC Sans" w:eastAsia="BC Sans" w:hAnsi="BC Sans" w:cs="BC Sans"/>
-                <w:color w:val="1A1A2E"/>
-                <w:sz w:val="24"/>
-                <w:szCs w:val="24"/>
-                <w:lang w:val="en-CA"/>
-              </w:rPr>
-              <w:t>{/questions</w:t>
-            </w:r>
-            <w:proofErr w:type="gramStart"/>
-            <w:r>
-              <w:rPr>
-                <w:rFonts w:ascii="BC Sans" w:eastAsia="BC Sans" w:hAnsi="BC Sans" w:cs="BC Sans"/>
-                <w:color w:val="1A1A2E"/>
-                <w:sz w:val="24"/>
-                <w:szCs w:val="24"/>
-                <w:lang w:val="en-CA"/>
-              </w:rPr>
-              <w:t>}}{</w:t>
-            </w:r>
-            <w:proofErr w:type="gramEnd"/>
-            <w:r>
-              <w:rPr>
-                <w:rFonts w:ascii="BC Sans" w:eastAsia="BC Sans" w:hAnsi="BC Sans" w:cs="BC Sans"/>
-                <w:color w:val="1A1A2E"/>
-                <w:sz w:val="24"/>
-                <w:szCs w:val="24"/>
-                <w:lang w:val="en-CA"/>
-              </w:rPr>
-              <w:t>{/findings}}</w:t>
+              <w:t>{{complianceDueDate}}</w:t>
+            </w:r>
+            <w:r>
+              <w:rPr>
+                <w:rFonts w:ascii="BC Sans" w:eastAsia="BC Sans" w:hAnsi="BC Sans" w:cs="BC Sans"/>
+                <w:color w:val="1A1A2E"/>
+                <w:sz w:val="24"/>
+                <w:szCs w:val="24"/>
+                <w:lang w:val="en-CA"/>
+              </w:rPr>
+              <w:t>{{/IF_showDueDate}}</w:t>
+            </w:r>
+            <w:r>
+              <w:rPr>
+                <w:rFonts w:ascii="BC Sans" w:eastAsia="BC Sans" w:hAnsi="BC Sans" w:cs="BC Sans"/>
+                <w:color w:val="1A1A2E"/>
+                <w:sz w:val="24"/>
+                <w:szCs w:val="24"/>
+                <w:lang w:val="en-CA"/>
+              </w:rPr>
+              <w:t>{{/questions}}{{/findings}}</w:t>
             </w:r>
           </w:p>
         </w:tc>
@@ -2447,7 +2009,6 @@
         <w:t>InspectionFindings</w:t>
       </w:r>
       <w:proofErr w:type="spellEnd"/>
-      <w:proofErr w:type="gramStart"/>
       <w:r>
         <w:rPr>
           <w:rFonts w:ascii="BC Sans" w:hAnsi="BC Sans"/>
@@ -2469,20 +2030,7 @@
           <w:szCs w:val="24"/>
           <w:lang w:val="en-CA"/>
         </w:rPr>
-        <w:t>{</w:t>
-      </w:r>
-      <w:proofErr w:type="gramEnd"/>
-      <w:r>
-        <w:rPr>
-          <w:rFonts w:ascii="BC Sans" w:hAnsi="BC Sans"/>
-          <w:b/>
-          <w:bCs/>
-          <w:color w:val="2F5496" w:themeColor="accent1" w:themeShade="BF"/>
-          <w:sz w:val="24"/>
-          <w:szCs w:val="24"/>
-          <w:lang w:val="en-CA"/>
-        </w:rPr>
-        <w:t>{#IF_showClosingComments}}</w:t>
+        <w:t>{{#IF_showClosingComments}}</w:t>
       </w:r>
       <w:r>
         <w:rPr>
@@ -2542,7 +2090,6 @@
         <w:t>closingComments</w:t>
       </w:r>
       <w:proofErr w:type="spellEnd"/>
-      <w:proofErr w:type="gramStart"/>
       <w:r>
         <w:rPr>
           <w:rFonts w:ascii="BC Sans" w:hAnsi="BC Sans"/>
@@ -2551,18 +2098,7 @@
           <w:szCs w:val="24"/>
           <w:lang w:val="en-CA"/>
         </w:rPr>
-        <w:t>}}{</w:t>
-      </w:r>
-      <w:proofErr w:type="gramEnd"/>
-      <w:r>
-        <w:rPr>
-          <w:rFonts w:ascii="BC Sans" w:hAnsi="BC Sans"/>
-          <w:color w:val="000000" w:themeColor="text1"/>
-          <w:sz w:val="24"/>
-          <w:szCs w:val="24"/>
-          <w:lang w:val="en-CA"/>
-        </w:rPr>
-        <w:t>{/</w:t>
+        <w:t>}}{{/</w:t>
       </w:r>
       <w:proofErr w:type="spellStart"/>
       <w:r>
@@ -2601,12 +2137,12 @@
       <w:tblPr>
         <w:tblpPr w:leftFromText="180" w:rightFromText="180" w:vertAnchor="text" w:tblpY="1"/>
         <w:tblOverlap w:val="never"/>
-        <w:tblW w:w="4957" w:type="dxa"/>
+        <w:tblW w:w="8359" w:type="dxa"/>
         <w:tblLayout w:type="fixed"/>
         <w:tblLook w:val="0000" w:firstRow="0" w:lastRow="0" w:firstColumn="0" w:lastColumn="0" w:noHBand="0" w:noVBand="0"/>
       </w:tblPr>
       <w:tblGrid>
-        <w:gridCol w:w="4957"/>
+        <w:gridCol w:w="8359"/>
       </w:tblGrid>
       <w:tr>
         <w:trPr>
@@ -2614,7 +2150,7 @@
         </w:trPr>
         <w:tc>
           <w:tcPr>
-            <w:tcW w:w="4957" w:type="dxa"/>
+            <w:tcW w:w="8359" w:type="dxa"/>
             <w:tcMar>
               <w:top w:w="80" w:type="dxa"/>
               <w:left w:w="0" w:type="dxa"/>
@@ -2796,19 +2332,8 @@
                 <w:szCs w:val="24"/>
                 <w:lang w:val="en-US"/>
               </w:rPr>
-              <w:t xml:space="preserve">Signature </w:t>
-            </w:r>
-            <w:proofErr w:type="gramStart"/>
-            <w:r>
-              <w:rPr>
-                <w:rFonts w:ascii="BC Sans" w:eastAsia="BC Sans" w:hAnsi="BC Sans" w:cs="BC Sans"/>
-                <w:b/>
-                <w:bCs/>
-                <w:sz w:val="24"/>
-                <w:szCs w:val="24"/>
-                <w:lang w:val="en-US"/>
-              </w:rPr>
-              <w:t xml:space="preserve">Refusal: </w:t>
+              <w:lastRenderedPageBreak/>
+              <w:t xml:space="preserve">Signature Refusal: </w:t>
             </w:r>
             <w:r>
               <w:rPr>
@@ -2829,7 +2354,6 @@
               <w:t>{</w:t>
             </w:r>
             <w:proofErr w:type="spellStart"/>
-            <w:proofErr w:type="gramEnd"/>
             <w:r>
               <w:rPr>
                 <w:rFonts w:ascii="BC Sans" w:eastAsia="BC Sans" w:hAnsi="BC Sans" w:cs="BC Sans"/>
@@ -2881,10 +2405,8 @@
                 <w:szCs w:val="24"/>
                 <w:lang w:val="en-CA"/>
               </w:rPr>
-              <w:lastRenderedPageBreak/>
-              <w:t>{{#IF_showDeliveryMethod</w:t>
-            </w:r>
-            <w:proofErr w:type="gramStart"/>
+              <w:t>{{#IF_showDeliveryMethod}}</w:t>
+            </w:r>
             <w:r>
               <w:rPr>
                 <w:rFonts w:ascii="BC Sans" w:eastAsia="BC Sans" w:hAnsi="BC Sans" w:cs="BC Sans"/>
@@ -2892,32 +2414,9 @@
                 <w:bCs/>
                 <w:sz w:val="24"/>
                 <w:szCs w:val="24"/>
-                <w:lang w:val="en-CA"/>
-              </w:rPr>
-              <w:t>}}</w:t>
-            </w:r>
-            <w:r>
-              <w:rPr>
-                <w:rFonts w:ascii="BC Sans" w:eastAsia="BC Sans" w:hAnsi="BC Sans" w:cs="BC Sans"/>
-                <w:b/>
-                <w:bCs/>
-                <w:sz w:val="24"/>
-                <w:szCs w:val="24"/>
-                <w:lang w:val="en-US"/>
-              </w:rPr>
-              <w:t>Intended</w:t>
-            </w:r>
-            <w:proofErr w:type="gramEnd"/>
-            <w:r>
-              <w:rPr>
-                <w:rFonts w:ascii="BC Sans" w:eastAsia="BC Sans" w:hAnsi="BC Sans" w:cs="BC Sans"/>
-                <w:b/>
-                <w:bCs/>
-                <w:sz w:val="24"/>
-                <w:szCs w:val="24"/>
-                <w:lang w:val="en-US"/>
-              </w:rPr>
-              <w:t xml:space="preserve"> Delivery Method: </w:t>
+                <w:lang w:val="en-US"/>
+              </w:rPr>
+              <w:t xml:space="preserve">Intended Delivery Method: </w:t>
             </w:r>
             <w:r>
               <w:rPr>
@@ -3023,7 +2522,7 @@
 </file>
 
 <file path=word/endnotes.xml><?xml version="1.0" encoding="utf-8"?>
-<w:endnotes xmlns:wpc="http://schemas.microsoft.com/office/word/2010/wordprocessingCanvas" xmlns:cx="http://schemas.microsoft.com/office/drawing/2014/chartex" xmlns:cx1="http://schemas.microsoft.com/office/drawing/2015/9/8/chartex" xmlns:cx2="http://schemas.microsoft.com/office/drawing/2015/10/21/chartex" xmlns:cx3="http://schemas.microsoft.com/office/drawing/2016/5/9/chartex" xmlns:cx4="http://schemas.microsoft.com/office/drawing/2016/5/10/chartex" xmlns:cx5="http://schemas.microsoft.com/office/drawing/2016/5/11/chartex" xmlns:cx6="http://schemas.microsoft.com/office/drawing/2016/5/12/chartex" xmlns:cx7="http://schemas.microsoft.com/office/drawing/2016/5/13/chartex" xmlns:cx8="http://schemas.microsoft.com/office/drawing/2016/5/14/chartex" xmlns:mc="http://schemas.openxmlformats.org/markup-compatibility/2006" xmlns:aink="http://schemas.microsoft.com/office/drawing/2016/ink" xmlns:am3d="http://schemas.microsoft.com/office/drawing/2017/model3d" xmlns:o="urn:schemas-microsoft-com:office:office" xmlns:oel="http://schemas.microsoft.com/office/2019/extlst" xmlns:r="http://schemas.openxmlformats.org/officeDocument/2006/relationships" xmlns:m="http://schemas.openxmlformats.org/officeDocument/2006/math" xmlns:v="urn:schemas-microsoft-com:vml" xmlns:wp14="http://schemas.microsoft.com/office/word/2010/wordprocessingDrawing" xmlns:wp="http://schemas.openxmlformats.org/drawingml/2006/wordprocessingDrawing" xmlns:w10="urn:schemas-microsoft-com:office:word" xmlns:w="http://schemas.openxmlformats.org/wordprocessingml/2006/main" xmlns:w14="http://schemas.microsoft.com/office/word/2010/wordml" xmlns:w15="http://schemas.microsoft.com/office/word/2012/wordml" xmlns:w16cei="http://schemas.microsoft.com/office/word/2026/wordml/cei" xmlns:w16cex="http://schemas.microsoft.com/office/word/2018/wordml/cex" xmlns:w16cid="http://schemas.microsoft.com/office/word/2016/wordml/cid" xmlns:w16="http://schemas.microsoft.com/office/word/2018/wordml" xmlns:w16du="http://schemas.microsoft.com/office/word/2023/wordml/word16du" xmlns:w16sdtdh="http://schemas.microsoft.com/office/word/2020/wordml/sdtdatahash" xmlns:w16sdtfl="http://schemas.microsoft.com/office/word/2024/wordml/sdtformatlock" xmlns:w16se="http://schemas.microsoft.com/office/word/2015/wordml/symex" xmlns:wpg="http://schemas.microsoft.com/office/word/2010/wordprocessingGroup" xmlns:wpi="http://schemas.microsoft.com/office/word/2010/wordprocessingInk" xmlns:wne="http://schemas.microsoft.com/office/word/2006/wordml" xmlns:wps="http://schemas.microsoft.com/office/word/2010/wordprocessingShape" mc:Ignorable="w14 w15 w16se w16cid w16 w16cex w16sdtdh w16sdtfl w16du wp14">
+<w:endnotes xmlns:wpc="http://schemas.microsoft.com/office/word/2010/wordprocessingCanvas" xmlns:cx="http://schemas.microsoft.com/office/drawing/2014/chartex" xmlns:cx1="http://schemas.microsoft.com/office/drawing/2015/9/8/chartex" xmlns:cx2="http://schemas.microsoft.com/office/drawing/2015/10/21/chartex" xmlns:cx3="http://schemas.microsoft.com/office/drawing/2016/5/9/chartex" xmlns:cx4="http://schemas.microsoft.com/office/drawing/2016/5/10/chartex" xmlns:cx5="http://schemas.microsoft.com/office/drawing/2016/5/11/chartex" xmlns:cx6="http://schemas.microsoft.com/office/drawing/2016/5/12/chartex" xmlns:cx7="http://schemas.microsoft.com/office/drawing/2016/5/13/chartex" xmlns:cx8="http://schemas.microsoft.com/office/drawing/2016/5/14/chartex" xmlns:mc="http://schemas.openxmlformats.org/markup-compatibility/2006" xmlns:aink="http://schemas.microsoft.com/office/drawing/2016/ink" xmlns:am3d="http://schemas.microsoft.com/office/drawing/2017/model3d" xmlns:o="urn:schemas-microsoft-com:office:office" xmlns:oel="http://schemas.microsoft.com/office/2019/extlst" xmlns:r="http://schemas.openxmlformats.org/officeDocument/2006/relationships" xmlns:m="http://schemas.openxmlformats.org/officeDocument/2006/math" xmlns:v="urn:schemas-microsoft-com:vml" xmlns:wp14="http://schemas.microsoft.com/office/word/2010/wordprocessingDrawing" xmlns:wp="http://schemas.openxmlformats.org/drawingml/2006/wordprocessingDrawing" xmlns:w10="urn:schemas-microsoft-com:office:word" xmlns:w="http://schemas.openxmlformats.org/wordprocessingml/2006/main" xmlns:w14="http://schemas.microsoft.com/office/word/2010/wordml" xmlns:w15="http://schemas.microsoft.com/office/word/2012/wordml" xmlns:w16cex="http://schemas.microsoft.com/office/word/2018/wordml/cex" xmlns:w16cid="http://schemas.microsoft.com/office/word/2016/wordml/cid" xmlns:w16="http://schemas.microsoft.com/office/word/2018/wordml" xmlns:w16du="http://schemas.microsoft.com/office/word/2023/wordml/word16du" xmlns:w16sdtdh="http://schemas.microsoft.com/office/word/2020/wordml/sdtdatahash" xmlns:w16sdtfl="http://schemas.microsoft.com/office/word/2024/wordml/sdtformatlock" xmlns:w16se="http://schemas.microsoft.com/office/word/2015/wordml/symex" xmlns:wpg="http://schemas.microsoft.com/office/word/2010/wordprocessingGroup" xmlns:wpi="http://schemas.microsoft.com/office/word/2010/wordprocessingInk" xmlns:wne="http://schemas.microsoft.com/office/word/2006/wordml" xmlns:wps="http://schemas.microsoft.com/office/word/2010/wordprocessingShape" mc:Ignorable="w14 w15 w16se w16cid w16 w16cex w16sdtdh w16sdtfl w16du wp14">
   <w:endnote w:type="separator" w:id="-1">
     <w:p>
       <w:r>
@@ -3042,7 +2541,7 @@
 </file>
 
 <file path=word/footer1.xml><?xml version="1.0" encoding="utf-8"?>
-<w:ftr xmlns:wpc="http://schemas.microsoft.com/office/word/2010/wordprocessingCanvas" xmlns:cx="http://schemas.microsoft.com/office/drawing/2014/chartex" xmlns:cx1="http://schemas.microsoft.com/office/drawing/2015/9/8/chartex" xmlns:cx2="http://schemas.microsoft.com/office/drawing/2015/10/21/chartex" xmlns:cx3="http://schemas.microsoft.com/office/drawing/2016/5/9/chartex" xmlns:cx4="http://schemas.microsoft.com/office/drawing/2016/5/10/chartex" xmlns:cx5="http://schemas.microsoft.com/office/drawing/2016/5/11/chartex" xmlns:cx6="http://schemas.microsoft.com/office/drawing/2016/5/12/chartex" xmlns:cx7="http://schemas.microsoft.com/office/drawing/2016/5/13/chartex" xmlns:cx8="http://schemas.microsoft.com/office/drawing/2016/5/14/chartex" xmlns:mc="http://schemas.openxmlformats.org/markup-compatibility/2006" xmlns:aink="http://schemas.microsoft.com/office/drawing/2016/ink" xmlns:am3d="http://schemas.microsoft.com/office/drawing/2017/model3d" xmlns:o="urn:schemas-microsoft-com:office:office" xmlns:oel="http://schemas.microsoft.com/office/2019/extlst" xmlns:r="http://schemas.openxmlformats.org/officeDocument/2006/relationships" xmlns:m="http://schemas.openxmlformats.org/officeDocument/2006/math" xmlns:v="urn:schemas-microsoft-com:vml" xmlns:wp14="http://schemas.microsoft.com/office/word/2010/wordprocessingDrawing" xmlns:wp="http://schemas.openxmlformats.org/drawingml/2006/wordprocessingDrawing" xmlns:w10="urn:schemas-microsoft-com:office:word" xmlns:w="http://schemas.openxmlformats.org/wordprocessingml/2006/main" xmlns:w14="http://schemas.microsoft.com/office/word/2010/wordml" xmlns:w15="http://schemas.microsoft.com/office/word/2012/wordml" xmlns:w16cei="http://schemas.microsoft.com/office/word/2026/wordml/cei" xmlns:w16cex="http://schemas.microsoft.com/office/word/2018/wordml/cex" xmlns:w16cid="http://schemas.microsoft.com/office/word/2016/wordml/cid" xmlns:w16="http://schemas.microsoft.com/office/word/2018/wordml" xmlns:w16du="http://schemas.microsoft.com/office/word/2023/wordml/word16du" xmlns:w16sdtdh="http://schemas.microsoft.com/office/word/2020/wordml/sdtdatahash" xmlns:w16sdtfl="http://schemas.microsoft.com/office/word/2024/wordml/sdtformatlock" xmlns:w16se="http://schemas.microsoft.com/office/word/2015/wordml/symex" xmlns:wpg="http://schemas.microsoft.com/office/word/2010/wordprocessingGroup" xmlns:wpi="http://schemas.microsoft.com/office/word/2010/wordprocessingInk" xmlns:wne="http://schemas.microsoft.com/office/word/2006/wordml" xmlns:wps="http://schemas.microsoft.com/office/word/2010/wordprocessingShape" mc:Ignorable="w14 w15 w16se w16cid w16 w16cex w16sdtdh w16sdtfl w16du wp14">
+<w:ftr xmlns:wpc="http://schemas.microsoft.com/office/word/2010/wordprocessingCanvas" xmlns:cx="http://schemas.microsoft.com/office/drawing/2014/chartex" xmlns:cx1="http://schemas.microsoft.com/office/drawing/2015/9/8/chartex" xmlns:cx2="http://schemas.microsoft.com/office/drawing/2015/10/21/chartex" xmlns:cx3="http://schemas.microsoft.com/office/drawing/2016/5/9/chartex" xmlns:cx4="http://schemas.microsoft.com/office/drawing/2016/5/10/chartex" xmlns:cx5="http://schemas.microsoft.com/office/drawing/2016/5/11/chartex" xmlns:cx6="http://schemas.microsoft.com/office/drawing/2016/5/12/chartex" xmlns:cx7="http://schemas.microsoft.com/office/drawing/2016/5/13/chartex" xmlns:cx8="http://schemas.microsoft.com/office/drawing/2016/5/14/chartex" xmlns:mc="http://schemas.openxmlformats.org/markup-compatibility/2006" xmlns:aink="http://schemas.microsoft.com/office/drawing/2016/ink" xmlns:am3d="http://schemas.microsoft.com/office/drawing/2017/model3d" xmlns:o="urn:schemas-microsoft-com:office:office" xmlns:oel="http://schemas.microsoft.com/office/2019/extlst" xmlns:r="http://schemas.openxmlformats.org/officeDocument/2006/relationships" xmlns:m="http://schemas.openxmlformats.org/officeDocument/2006/math" xmlns:v="urn:schemas-microsoft-com:vml" xmlns:wp14="http://schemas.microsoft.com/office/word/2010/wordprocessingDrawing" xmlns:wp="http://schemas.openxmlformats.org/drawingml/2006/wordprocessingDrawing" xmlns:w10="urn:schemas-microsoft-com:office:word" xmlns:w="http://schemas.openxmlformats.org/wordprocessingml/2006/main" xmlns:w14="http://schemas.microsoft.com/office/word/2010/wordml" xmlns:w15="http://schemas.microsoft.com/office/word/2012/wordml" xmlns:w16cex="http://schemas.microsoft.com/office/word/2018/wordml/cex" xmlns:w16cid="http://schemas.microsoft.com/office/word/2016/wordml/cid" xmlns:w16="http://schemas.microsoft.com/office/word/2018/wordml" xmlns:w16du="http://schemas.microsoft.com/office/word/2023/wordml/word16du" xmlns:w16sdtdh="http://schemas.microsoft.com/office/word/2020/wordml/sdtdatahash" xmlns:w16sdtfl="http://schemas.microsoft.com/office/word/2024/wordml/sdtformatlock" xmlns:w16se="http://schemas.microsoft.com/office/word/2015/wordml/symex" xmlns:wpg="http://schemas.microsoft.com/office/word/2010/wordprocessingGroup" xmlns:wpi="http://schemas.microsoft.com/office/word/2010/wordprocessingInk" xmlns:wne="http://schemas.microsoft.com/office/word/2006/wordml" xmlns:wps="http://schemas.microsoft.com/office/word/2010/wordprocessingShape" mc:Ignorable="w14 w15 w16se w16cid w16 w16cex w16sdtdh w16sdtfl w16du wp14">
   <w:p>
     <w:pPr>
       <w:pStyle w:val="Footer"/>
@@ -3052,7 +2551,7 @@
 </file>
 
 <file path=word/footer2.xml><?xml version="1.0" encoding="utf-8"?>
-<w:ftr xmlns:wpc="http://schemas.microsoft.com/office/word/2010/wordprocessingCanvas" xmlns:cx="http://schemas.microsoft.com/office/drawing/2014/chartex" xmlns:cx1="http://schemas.microsoft.com/office/drawing/2015/9/8/chartex" xmlns:cx2="http://schemas.microsoft.com/office/drawing/2015/10/21/chartex" xmlns:cx3="http://schemas.microsoft.com/office/drawing/2016/5/9/chartex" xmlns:cx4="http://schemas.microsoft.com/office/drawing/2016/5/10/chartex" xmlns:cx5="http://schemas.microsoft.com/office/drawing/2016/5/11/chartex" xmlns:cx6="http://schemas.microsoft.com/office/drawing/2016/5/12/chartex" xmlns:cx7="http://schemas.microsoft.com/office/drawing/2016/5/13/chartex" xmlns:cx8="http://schemas.microsoft.com/office/drawing/2016/5/14/chartex" xmlns:mc="http://schemas.openxmlformats.org/markup-compatibility/2006" xmlns:aink="http://schemas.microsoft.com/office/drawing/2016/ink" xmlns:am3d="http://schemas.microsoft.com/office/drawing/2017/model3d" xmlns:o="urn:schemas-microsoft-com:office:office" xmlns:oel="http://schemas.microsoft.com/office/2019/extlst" xmlns:r="http://schemas.openxmlformats.org/officeDocument/2006/relationships" xmlns:m="http://schemas.openxmlformats.org/officeDocument/2006/math" xmlns:v="urn:schemas-microsoft-com:vml" xmlns:wp14="http://schemas.microsoft.com/office/word/2010/wordprocessingDrawing" xmlns:wp="http://schemas.openxmlformats.org/drawingml/2006/wordprocessingDrawing" xmlns:w10="urn:schemas-microsoft-com:office:word" xmlns:w="http://schemas.openxmlformats.org/wordprocessingml/2006/main" xmlns:w14="http://schemas.microsoft.com/office/word/2010/wordml" xmlns:w15="http://schemas.microsoft.com/office/word/2012/wordml" xmlns:w16cei="http://schemas.microsoft.com/office/word/2026/wordml/cei" xmlns:w16cex="http://schemas.microsoft.com/office/word/2018/wordml/cex" xmlns:w16cid="http://schemas.microsoft.com/office/word/2016/wordml/cid" xmlns:w16="http://schemas.microsoft.com/office/word/2018/wordml" xmlns:w16du="http://schemas.microsoft.com/office/word/2023/wordml/word16du" xmlns:w16sdtdh="http://schemas.microsoft.com/office/word/2020/wordml/sdtdatahash" xmlns:w16sdtfl="http://schemas.microsoft.com/office/word/2024/wordml/sdtformatlock" xmlns:w16se="http://schemas.microsoft.com/office/word/2015/wordml/symex" xmlns:wpg="http://schemas.microsoft.com/office/word/2010/wordprocessingGroup" xmlns:wpi="http://schemas.microsoft.com/office/word/2010/wordprocessingInk" xmlns:wne="http://schemas.microsoft.com/office/word/2006/wordml" xmlns:wps="http://schemas.microsoft.com/office/word/2010/wordprocessingShape" mc:Ignorable="w14 w15 w16se w16cid w16 w16cex w16sdtdh w16sdtfl w16du wp14">
+<w:ftr xmlns:wpc="http://schemas.microsoft.com/office/word/2010/wordprocessingCanvas" xmlns:cx="http://schemas.microsoft.com/office/drawing/2014/chartex" xmlns:cx1="http://schemas.microsoft.com/office/drawing/2015/9/8/chartex" xmlns:cx2="http://schemas.microsoft.com/office/drawing/2015/10/21/chartex" xmlns:cx3="http://schemas.microsoft.com/office/drawing/2016/5/9/chartex" xmlns:cx4="http://schemas.microsoft.com/office/drawing/2016/5/10/chartex" xmlns:cx5="http://schemas.microsoft.com/office/drawing/2016/5/11/chartex" xmlns:cx6="http://schemas.microsoft.com/office/drawing/2016/5/12/chartex" xmlns:cx7="http://schemas.microsoft.com/office/drawing/2016/5/13/chartex" xmlns:cx8="http://schemas.microsoft.com/office/drawing/2016/5/14/chartex" xmlns:mc="http://schemas.openxmlformats.org/markup-compatibility/2006" xmlns:aink="http://schemas.microsoft.com/office/drawing/2016/ink" xmlns:am3d="http://schemas.microsoft.com/office/drawing/2017/model3d" xmlns:o="urn:schemas-microsoft-com:office:office" xmlns:oel="http://schemas.microsoft.com/office/2019/extlst" xmlns:r="http://schemas.openxmlformats.org/officeDocument/2006/relationships" xmlns:m="http://schemas.openxmlformats.org/officeDocument/2006/math" xmlns:v="urn:schemas-microsoft-com:vml" xmlns:wp14="http://schemas.microsoft.com/office/word/2010/wordprocessingDrawing" xmlns:wp="http://schemas.openxmlformats.org/drawingml/2006/wordprocessingDrawing" xmlns:w10="urn:schemas-microsoft-com:office:word" xmlns:w="http://schemas.openxmlformats.org/wordprocessingml/2006/main" xmlns:w14="http://schemas.microsoft.com/office/word/2010/wordml" xmlns:w15="http://schemas.microsoft.com/office/word/2012/wordml" xmlns:w16cex="http://schemas.microsoft.com/office/word/2018/wordml/cex" xmlns:w16cid="http://schemas.microsoft.com/office/word/2016/wordml/cid" xmlns:w16="http://schemas.microsoft.com/office/word/2018/wordml" xmlns:w16du="http://schemas.microsoft.com/office/word/2023/wordml/word16du" xmlns:w16sdtdh="http://schemas.microsoft.com/office/word/2020/wordml/sdtdatahash" xmlns:w16sdtfl="http://schemas.microsoft.com/office/word/2024/wordml/sdtformatlock" xmlns:w16se="http://schemas.microsoft.com/office/word/2015/wordml/symex" xmlns:wpg="http://schemas.microsoft.com/office/word/2010/wordprocessingGroup" xmlns:wpi="http://schemas.microsoft.com/office/word/2010/wordprocessingInk" xmlns:wne="http://schemas.microsoft.com/office/word/2006/wordml" xmlns:wps="http://schemas.microsoft.com/office/word/2010/wordprocessingShape" mc:Ignorable="w14 w15 w16se w16cid w16 w16cex w16sdtdh w16sdtfl w16du wp14">
   <w:sdt>
     <w:sdtPr>
       <w:rPr>
@@ -3181,7 +2680,7 @@
 </file>
 
 <file path=word/footer3.xml><?xml version="1.0" encoding="utf-8"?>
-<w:ftr xmlns:wpc="http://schemas.microsoft.com/office/word/2010/wordprocessingCanvas" xmlns:cx="http://schemas.microsoft.com/office/drawing/2014/chartex" xmlns:cx1="http://schemas.microsoft.com/office/drawing/2015/9/8/chartex" xmlns:cx2="http://schemas.microsoft.com/office/drawing/2015/10/21/chartex" xmlns:cx3="http://schemas.microsoft.com/office/drawing/2016/5/9/chartex" xmlns:cx4="http://schemas.microsoft.com/office/drawing/2016/5/10/chartex" xmlns:cx5="http://schemas.microsoft.com/office/drawing/2016/5/11/chartex" xmlns:cx6="http://schemas.microsoft.com/office/drawing/2016/5/12/chartex" xmlns:cx7="http://schemas.microsoft.com/office/drawing/2016/5/13/chartex" xmlns:cx8="http://schemas.microsoft.com/office/drawing/2016/5/14/chartex" xmlns:mc="http://schemas.openxmlformats.org/markup-compatibility/2006" xmlns:aink="http://schemas.microsoft.com/office/drawing/2016/ink" xmlns:am3d="http://schemas.microsoft.com/office/drawing/2017/model3d" xmlns:o="urn:schemas-microsoft-com:office:office" xmlns:oel="http://schemas.microsoft.com/office/2019/extlst" xmlns:r="http://schemas.openxmlformats.org/officeDocument/2006/relationships" xmlns:m="http://schemas.openxmlformats.org/officeDocument/2006/math" xmlns:v="urn:schemas-microsoft-com:vml" xmlns:wp14="http://schemas.microsoft.com/office/word/2010/wordprocessingDrawing" xmlns:wp="http://schemas.openxmlformats.org/drawingml/2006/wordprocessingDrawing" xmlns:w10="urn:schemas-microsoft-com:office:word" xmlns:w="http://schemas.openxmlformats.org/wordprocessingml/2006/main" xmlns:w14="http://schemas.microsoft.com/office/word/2010/wordml" xmlns:w15="http://schemas.microsoft.com/office/word/2012/wordml" xmlns:w16cei="http://schemas.microsoft.com/office/word/2026/wordml/cei" xmlns:w16cex="http://schemas.microsoft.com/office/word/2018/wordml/cex" xmlns:w16cid="http://schemas.microsoft.com/office/word/2016/wordml/cid" xmlns:w16="http://schemas.microsoft.com/office/word/2018/wordml" xmlns:w16du="http://schemas.microsoft.com/office/word/2023/wordml/word16du" xmlns:w16sdtdh="http://schemas.microsoft.com/office/word/2020/wordml/sdtdatahash" xmlns:w16sdtfl="http://schemas.microsoft.com/office/word/2024/wordml/sdtformatlock" xmlns:w16se="http://schemas.microsoft.com/office/word/2015/wordml/symex" xmlns:wpg="http://schemas.microsoft.com/office/word/2010/wordprocessingGroup" xmlns:wpi="http://schemas.microsoft.com/office/word/2010/wordprocessingInk" xmlns:wne="http://schemas.microsoft.com/office/word/2006/wordml" xmlns:wps="http://schemas.microsoft.com/office/word/2010/wordprocessingShape" mc:Ignorable="w14 w15 w16se w16cid w16 w16cex w16sdtdh w16sdtfl w16du wp14">
+<w:ftr xmlns:wpc="http://schemas.microsoft.com/office/word/2010/wordprocessingCanvas" xmlns:cx="http://schemas.microsoft.com/office/drawing/2014/chartex" xmlns:cx1="http://schemas.microsoft.com/office/drawing/2015/9/8/chartex" xmlns:cx2="http://schemas.microsoft.com/office/drawing/2015/10/21/chartex" xmlns:cx3="http://schemas.microsoft.com/office/drawing/2016/5/9/chartex" xmlns:cx4="http://schemas.microsoft.com/office/drawing/2016/5/10/chartex" xmlns:cx5="http://schemas.microsoft.com/office/drawing/2016/5/11/chartex" xmlns:cx6="http://schemas.microsoft.com/office/drawing/2016/5/12/chartex" xmlns:cx7="http://schemas.microsoft.com/office/drawing/2016/5/13/chartex" xmlns:cx8="http://schemas.microsoft.com/office/drawing/2016/5/14/chartex" xmlns:mc="http://schemas.openxmlformats.org/markup-compatibility/2006" xmlns:aink="http://schemas.microsoft.com/office/drawing/2016/ink" xmlns:am3d="http://schemas.microsoft.com/office/drawing/2017/model3d" xmlns:o="urn:schemas-microsoft-com:office:office" xmlns:oel="http://schemas.microsoft.com/office/2019/extlst" xmlns:r="http://schemas.openxmlformats.org/officeDocument/2006/relationships" xmlns:m="http://schemas.openxmlformats.org/officeDocument/2006/math" xmlns:v="urn:schemas-microsoft-com:vml" xmlns:wp14="http://schemas.microsoft.com/office/word/2010/wordprocessingDrawing" xmlns:wp="http://schemas.openxmlformats.org/drawingml/2006/wordprocessingDrawing" xmlns:w10="urn:schemas-microsoft-com:office:word" xmlns:w="http://schemas.openxmlformats.org/wordprocessingml/2006/main" xmlns:w14="http://schemas.microsoft.com/office/word/2010/wordml" xmlns:w15="http://schemas.microsoft.com/office/word/2012/wordml" xmlns:w16cex="http://schemas.microsoft.com/office/word/2018/wordml/cex" xmlns:w16cid="http://schemas.microsoft.com/office/word/2016/wordml/cid" xmlns:w16="http://schemas.microsoft.com/office/word/2018/wordml" xmlns:w16du="http://schemas.microsoft.com/office/word/2023/wordml/word16du" xmlns:w16sdtdh="http://schemas.microsoft.com/office/word/2020/wordml/sdtdatahash" xmlns:w16sdtfl="http://schemas.microsoft.com/office/word/2024/wordml/sdtformatlock" xmlns:w16se="http://schemas.microsoft.com/office/word/2015/wordml/symex" xmlns:wpg="http://schemas.microsoft.com/office/word/2010/wordprocessingGroup" xmlns:wpi="http://schemas.microsoft.com/office/word/2010/wordprocessingInk" xmlns:wne="http://schemas.microsoft.com/office/word/2006/wordml" xmlns:wps="http://schemas.microsoft.com/office/word/2010/wordprocessingShape" mc:Ignorable="w14 w15 w16se w16cid w16 w16cex w16sdtdh w16sdtfl w16du wp14">
   <w:sdt>
     <w:sdtPr>
       <w:rPr>
@@ -3310,7 +2809,7 @@
 </file>
 
 <file path=word/footnotes.xml><?xml version="1.0" encoding="utf-8"?>
-<w:footnotes xmlns:wpc="http://schemas.microsoft.com/office/word/2010/wordprocessingCanvas" xmlns:cx="http://schemas.microsoft.com/office/drawing/2014/chartex" xmlns:cx1="http://schemas.microsoft.com/office/drawing/2015/9/8/chartex" xmlns:cx2="http://schemas.microsoft.com/office/drawing/2015/10/21/chartex" xmlns:cx3="http://schemas.microsoft.com/office/drawing/2016/5/9/chartex" xmlns:cx4="http://schemas.microsoft.com/office/drawing/2016/5/10/chartex" xmlns:cx5="http://schemas.microsoft.com/office/drawing/2016/5/11/chartex" xmlns:cx6="http://schemas.microsoft.com/office/drawing/2016/5/12/chartex" xmlns:cx7="http://schemas.microsoft.com/office/drawing/2016/5/13/chartex" xmlns:cx8="http://schemas.microsoft.com/office/drawing/2016/5/14/chartex" xmlns:mc="http://schemas.openxmlformats.org/markup-compatibility/2006" xmlns:aink="http://schemas.microsoft.com/office/drawing/2016/ink" xmlns:am3d="http://schemas.microsoft.com/office/drawing/2017/model3d" xmlns:o="urn:schemas-microsoft-com:office:office" xmlns:oel="http://schemas.microsoft.com/office/2019/extlst" xmlns:r="http://schemas.openxmlformats.org/officeDocument/2006/relationships" xmlns:m="http://schemas.openxmlformats.org/officeDocument/2006/math" xmlns:v="urn:schemas-microsoft-com:vml" xmlns:wp14="http://schemas.microsoft.com/office/word/2010/wordprocessingDrawing" xmlns:wp="http://schemas.openxmlformats.org/drawingml/2006/wordprocessingDrawing" xmlns:w10="urn:schemas-microsoft-com:office:word" xmlns:w="http://schemas.openxmlformats.org/wordprocessingml/2006/main" xmlns:w14="http://schemas.microsoft.com/office/word/2010/wordml" xmlns:w15="http://schemas.microsoft.com/office/word/2012/wordml" xmlns:w16cei="http://schemas.microsoft.com/office/word/2026/wordml/cei" xmlns:w16cex="http://schemas.microsoft.com/office/word/2018/wordml/cex" xmlns:w16cid="http://schemas.microsoft.com/office/word/2016/wordml/cid" xmlns:w16="http://schemas.microsoft.com/office/word/2018/wordml" xmlns:w16du="http://schemas.microsoft.com/office/word/2023/wordml/word16du" xmlns:w16sdtdh="http://schemas.microsoft.com/office/word/2020/wordml/sdtdatahash" xmlns:w16sdtfl="http://schemas.microsoft.com/office/word/2024/wordml/sdtformatlock" xmlns:w16se="http://schemas.microsoft.com/office/word/2015/wordml/symex" xmlns:wpg="http://schemas.microsoft.com/office/word/2010/wordprocessingGroup" xmlns:wpi="http://schemas.microsoft.com/office/word/2010/wordprocessingInk" xmlns:wne="http://schemas.microsoft.com/office/word/2006/wordml" xmlns:wps="http://schemas.microsoft.com/office/word/2010/wordprocessingShape" mc:Ignorable="w14 w15 w16se w16cid w16 w16cex w16sdtdh w16sdtfl w16du wp14">
+<w:footnotes xmlns:wpc="http://schemas.microsoft.com/office/word/2010/wordprocessingCanvas" xmlns:cx="http://schemas.microsoft.com/office/drawing/2014/chartex" xmlns:cx1="http://schemas.microsoft.com/office/drawing/2015/9/8/chartex" xmlns:cx2="http://schemas.microsoft.com/office/drawing/2015/10/21/chartex" xmlns:cx3="http://schemas.microsoft.com/office/drawing/2016/5/9/chartex" xmlns:cx4="http://schemas.microsoft.com/office/drawing/2016/5/10/chartex" xmlns:cx5="http://schemas.microsoft.com/office/drawing/2016/5/11/chartex" xmlns:cx6="http://schemas.microsoft.com/office/drawing/2016/5/12/chartex" xmlns:cx7="http://schemas.microsoft.com/office/drawing/2016/5/13/chartex" xmlns:cx8="http://schemas.microsoft.com/office/drawing/2016/5/14/chartex" xmlns:mc="http://schemas.openxmlformats.org/markup-compatibility/2006" xmlns:aink="http://schemas.microsoft.com/office/drawing/2016/ink" xmlns:am3d="http://schemas.microsoft.com/office/drawing/2017/model3d" xmlns:o="urn:schemas-microsoft-com:office:office" xmlns:oel="http://schemas.microsoft.com/office/2019/extlst" xmlns:r="http://schemas.openxmlformats.org/officeDocument/2006/relationships" xmlns:m="http://schemas.openxmlformats.org/officeDocument/2006/math" xmlns:v="urn:schemas-microsoft-com:vml" xmlns:wp14="http://schemas.microsoft.com/office/word/2010/wordprocessingDrawing" xmlns:wp="http://schemas.openxmlformats.org/drawingml/2006/wordprocessingDrawing" xmlns:w10="urn:schemas-microsoft-com:office:word" xmlns:w="http://schemas.openxmlformats.org/wordprocessingml/2006/main" xmlns:w14="http://schemas.microsoft.com/office/word/2010/wordml" xmlns:w15="http://schemas.microsoft.com/office/word/2012/wordml" xmlns:w16cex="http://schemas.microsoft.com/office/word/2018/wordml/cex" xmlns:w16cid="http://schemas.microsoft.com/office/word/2016/wordml/cid" xmlns:w16="http://schemas.microsoft.com/office/word/2018/wordml" xmlns:w16du="http://schemas.microsoft.com/office/word/2023/wordml/word16du" xmlns:w16sdtdh="http://schemas.microsoft.com/office/word/2020/wordml/sdtdatahash" xmlns:w16sdtfl="http://schemas.microsoft.com/office/word/2024/wordml/sdtformatlock" xmlns:w16se="http://schemas.microsoft.com/office/word/2015/wordml/symex" xmlns:wpg="http://schemas.microsoft.com/office/word/2010/wordprocessingGroup" xmlns:wpi="http://schemas.microsoft.com/office/word/2010/wordprocessingInk" xmlns:wne="http://schemas.microsoft.com/office/word/2006/wordml" xmlns:wps="http://schemas.microsoft.com/office/word/2010/wordprocessingShape" mc:Ignorable="w14 w15 w16se w16cid w16 w16cex w16sdtdh w16sdtfl w16du wp14">
   <w:footnote w:type="separator" w:id="-1">
     <w:p>
       <w:r>
@@ -3329,7 +2828,7 @@
 </file>
 
 <file path=word/header1.xml><?xml version="1.0" encoding="utf-8"?>
-<w:hdr xmlns:wpc="http://schemas.microsoft.com/office/word/2010/wordprocessingCanvas" xmlns:cx="http://schemas.microsoft.com/office/drawing/2014/chartex" xmlns:cx1="http://schemas.microsoft.com/office/drawing/2015/9/8/chartex" xmlns:cx2="http://schemas.microsoft.com/office/drawing/2015/10/21/chartex" xmlns:cx3="http://schemas.microsoft.com/office/drawing/2016/5/9/chartex" xmlns:cx4="http://schemas.microsoft.com/office/drawing/2016/5/10/chartex" xmlns:cx5="http://schemas.microsoft.com/office/drawing/2016/5/11/chartex" xmlns:cx6="http://schemas.microsoft.com/office/drawing/2016/5/12/chartex" xmlns:cx7="http://schemas.microsoft.com/office/drawing/2016/5/13/chartex" xmlns:cx8="http://schemas.microsoft.com/office/drawing/2016/5/14/chartex" xmlns:mc="http://schemas.openxmlformats.org/markup-compatibility/2006" xmlns:aink="http://schemas.microsoft.com/office/drawing/2016/ink" xmlns:am3d="http://schemas.microsoft.com/office/drawing/2017/model3d" xmlns:o="urn:schemas-microsoft-com:office:office" xmlns:oel="http://schemas.microsoft.com/office/2019/extlst" xmlns:r="http://schemas.openxmlformats.org/officeDocument/2006/relationships" xmlns:m="http://schemas.openxmlformats.org/officeDocument/2006/math" xmlns:v="urn:schemas-microsoft-com:vml" xmlns:wp14="http://schemas.microsoft.com/office/word/2010/wordprocessingDrawing" xmlns:wp="http://schemas.openxmlformats.org/drawingml/2006/wordprocessingDrawing" xmlns:w10="urn:schemas-microsoft-com:office:word" xmlns:w="http://schemas.openxmlformats.org/wordprocessingml/2006/main" xmlns:w14="http://schemas.microsoft.com/office/word/2010/wordml" xmlns:w15="http://schemas.microsoft.com/office/word/2012/wordml" xmlns:w16cei="http://schemas.microsoft.com/office/word/2026/wordml/cei" xmlns:w16cex="http://schemas.microsoft.com/office/word/2018/wordml/cex" xmlns:w16cid="http://schemas.microsoft.com/office/word/2016/wordml/cid" xmlns:w16="http://schemas.microsoft.com/office/word/2018/wordml" xmlns:w16du="http://schemas.microsoft.com/office/word/2023/wordml/word16du" xmlns:w16sdtdh="http://schemas.microsoft.com/office/word/2020/wordml/sdtdatahash" xmlns:w16sdtfl="http://schemas.microsoft.com/office/word/2024/wordml/sdtformatlock" xmlns:w16se="http://schemas.microsoft.com/office/word/2015/wordml/symex" xmlns:wpg="http://schemas.microsoft.com/office/word/2010/wordprocessingGroup" xmlns:wpi="http://schemas.microsoft.com/office/word/2010/wordprocessingInk" xmlns:wne="http://schemas.microsoft.com/office/word/2006/wordml" xmlns:wps="http://schemas.microsoft.com/office/word/2010/wordprocessingShape" mc:Ignorable="w14 w15 w16se w16cid w16 w16cex w16sdtdh w16sdtfl w16du wp14">
+<w:hdr xmlns:wpc="http://schemas.microsoft.com/office/word/2010/wordprocessingCanvas" xmlns:cx="http://schemas.microsoft.com/office/drawing/2014/chartex" xmlns:cx1="http://schemas.microsoft.com/office/drawing/2015/9/8/chartex" xmlns:cx2="http://schemas.microsoft.com/office/drawing/2015/10/21/chartex" xmlns:cx3="http://schemas.microsoft.com/office/drawing/2016/5/9/chartex" xmlns:cx4="http://schemas.microsoft.com/office/drawing/2016/5/10/chartex" xmlns:cx5="http://schemas.microsoft.com/office/drawing/2016/5/11/chartex" xmlns:cx6="http://schemas.microsoft.com/office/drawing/2016/5/12/chartex" xmlns:cx7="http://schemas.microsoft.com/office/drawing/2016/5/13/chartex" xmlns:cx8="http://schemas.microsoft.com/office/drawing/2016/5/14/chartex" xmlns:mc="http://schemas.openxmlformats.org/markup-compatibility/2006" xmlns:aink="http://schemas.microsoft.com/office/drawing/2016/ink" xmlns:am3d="http://schemas.microsoft.com/office/drawing/2017/model3d" xmlns:o="urn:schemas-microsoft-com:office:office" xmlns:oel="http://schemas.microsoft.com/office/2019/extlst" xmlns:r="http://schemas.openxmlformats.org/officeDocument/2006/relationships" xmlns:m="http://schemas.openxmlformats.org/officeDocument/2006/math" xmlns:v="urn:schemas-microsoft-com:vml" xmlns:wp14="http://schemas.microsoft.com/office/word/2010/wordprocessingDrawing" xmlns:wp="http://schemas.openxmlformats.org/drawingml/2006/wordprocessingDrawing" xmlns:w10="urn:schemas-microsoft-com:office:word" xmlns:w="http://schemas.openxmlformats.org/wordprocessingml/2006/main" xmlns:w14="http://schemas.microsoft.com/office/word/2010/wordml" xmlns:w15="http://schemas.microsoft.com/office/word/2012/wordml" xmlns:w16cex="http://schemas.microsoft.com/office/word/2018/wordml/cex" xmlns:w16cid="http://schemas.microsoft.com/office/word/2016/wordml/cid" xmlns:w16="http://schemas.microsoft.com/office/word/2018/wordml" xmlns:w16du="http://schemas.microsoft.com/office/word/2023/wordml/word16du" xmlns:w16sdtdh="http://schemas.microsoft.com/office/word/2020/wordml/sdtdatahash" xmlns:w16sdtfl="http://schemas.microsoft.com/office/word/2024/wordml/sdtformatlock" xmlns:w16se="http://schemas.microsoft.com/office/word/2015/wordml/symex" xmlns:wpg="http://schemas.microsoft.com/office/word/2010/wordprocessingGroup" xmlns:wpi="http://schemas.microsoft.com/office/word/2010/wordprocessingInk" xmlns:wne="http://schemas.microsoft.com/office/word/2006/wordml" xmlns:wps="http://schemas.microsoft.com/office/word/2010/wordprocessingShape" mc:Ignorable="w14 w15 w16se w16cid w16 w16cex w16sdtdh w16sdtfl w16du wp14">
   <w:p>
     <w:pPr>
       <w:pStyle w:val="Header"/>
@@ -3339,7 +2838,7 @@
 </file>
 
 <file path=word/header2.xml><?xml version="1.0" encoding="utf-8"?>
-<w:hdr xmlns:wpc="http://schemas.microsoft.com/office/word/2010/wordprocessingCanvas" xmlns:cx="http://schemas.microsoft.com/office/drawing/2014/chartex" xmlns:cx1="http://schemas.microsoft.com/office/drawing/2015/9/8/chartex" xmlns:cx2="http://schemas.microsoft.com/office/drawing/2015/10/21/chartex" xmlns:cx3="http://schemas.microsoft.com/office/drawing/2016/5/9/chartex" xmlns:cx4="http://schemas.microsoft.com/office/drawing/2016/5/10/chartex" xmlns:cx5="http://schemas.microsoft.com/office/drawing/2016/5/11/chartex" xmlns:cx6="http://schemas.microsoft.com/office/drawing/2016/5/12/chartex" xmlns:cx7="http://schemas.microsoft.com/office/drawing/2016/5/13/chartex" xmlns:cx8="http://schemas.microsoft.com/office/drawing/2016/5/14/chartex" xmlns:mc="http://schemas.openxmlformats.org/markup-compatibility/2006" xmlns:aink="http://schemas.microsoft.com/office/drawing/2016/ink" xmlns:am3d="http://schemas.microsoft.com/office/drawing/2017/model3d" xmlns:o="urn:schemas-microsoft-com:office:office" xmlns:oel="http://schemas.microsoft.com/office/2019/extlst" xmlns:r="http://schemas.openxmlformats.org/officeDocument/2006/relationships" xmlns:m="http://schemas.openxmlformats.org/officeDocument/2006/math" xmlns:v="urn:schemas-microsoft-com:vml" xmlns:wp14="http://schemas.microsoft.com/office/word/2010/wordprocessingDrawing" xmlns:wp="http://schemas.openxmlformats.org/drawingml/2006/wordprocessingDrawing" xmlns:w10="urn:schemas-microsoft-com:office:word" xmlns:w="http://schemas.openxmlformats.org/wordprocessingml/2006/main" xmlns:w14="http://schemas.microsoft.com/office/word/2010/wordml" xmlns:w15="http://schemas.microsoft.com/office/word/2012/wordml" xmlns:w16cei="http://schemas.microsoft.com/office/word/2026/wordml/cei" xmlns:w16cex="http://schemas.microsoft.com/office/word/2018/wordml/cex" xmlns:w16cid="http://schemas.microsoft.com/office/word/2016/wordml/cid" xmlns:w16="http://schemas.microsoft.com/office/word/2018/wordml" xmlns:w16du="http://schemas.microsoft.com/office/word/2023/wordml/word16du" xmlns:w16sdtdh="http://schemas.microsoft.com/office/word/2020/wordml/sdtdatahash" xmlns:w16sdtfl="http://schemas.microsoft.com/office/word/2024/wordml/sdtformatlock" xmlns:w16se="http://schemas.microsoft.com/office/word/2015/wordml/symex" xmlns:wpg="http://schemas.microsoft.com/office/word/2010/wordprocessingGroup" xmlns:wpi="http://schemas.microsoft.com/office/word/2010/wordprocessingInk" xmlns:wne="http://schemas.microsoft.com/office/word/2006/wordml" xmlns:wps="http://schemas.microsoft.com/office/word/2010/wordprocessingShape" mc:Ignorable="w14 w15 w16se w16cid w16 w16cex w16sdtdh w16sdtfl w16du wp14">
+<w:hdr xmlns:wpc="http://schemas.microsoft.com/office/word/2010/wordprocessingCanvas" xmlns:cx="http://schemas.microsoft.com/office/drawing/2014/chartex" xmlns:cx1="http://schemas.microsoft.com/office/drawing/2015/9/8/chartex" xmlns:cx2="http://schemas.microsoft.com/office/drawing/2015/10/21/chartex" xmlns:cx3="http://schemas.microsoft.com/office/drawing/2016/5/9/chartex" xmlns:cx4="http://schemas.microsoft.com/office/drawing/2016/5/10/chartex" xmlns:cx5="http://schemas.microsoft.com/office/drawing/2016/5/11/chartex" xmlns:cx6="http://schemas.microsoft.com/office/drawing/2016/5/12/chartex" xmlns:cx7="http://schemas.microsoft.com/office/drawing/2016/5/13/chartex" xmlns:cx8="http://schemas.microsoft.com/office/drawing/2016/5/14/chartex" xmlns:mc="http://schemas.openxmlformats.org/markup-compatibility/2006" xmlns:aink="http://schemas.microsoft.com/office/drawing/2016/ink" xmlns:am3d="http://schemas.microsoft.com/office/drawing/2017/model3d" xmlns:o="urn:schemas-microsoft-com:office:office" xmlns:oel="http://schemas.microsoft.com/office/2019/extlst" xmlns:r="http://schemas.openxmlformats.org/officeDocument/2006/relationships" xmlns:m="http://schemas.openxmlformats.org/officeDocument/2006/math" xmlns:v="urn:schemas-microsoft-com:vml" xmlns:wp14="http://schemas.microsoft.com/office/word/2010/wordprocessingDrawing" xmlns:wp="http://schemas.openxmlformats.org/drawingml/2006/wordprocessingDrawing" xmlns:w10="urn:schemas-microsoft-com:office:word" xmlns:w="http://schemas.openxmlformats.org/wordprocessingml/2006/main" xmlns:w14="http://schemas.microsoft.com/office/word/2010/wordml" xmlns:w15="http://schemas.microsoft.com/office/word/2012/wordml" xmlns:w16cex="http://schemas.microsoft.com/office/word/2018/wordml/cex" xmlns:w16cid="http://schemas.microsoft.com/office/word/2016/wordml/cid" xmlns:w16="http://schemas.microsoft.com/office/word/2018/wordml" xmlns:w16du="http://schemas.microsoft.com/office/word/2023/wordml/word16du" xmlns:w16sdtdh="http://schemas.microsoft.com/office/word/2020/wordml/sdtdatahash" xmlns:w16sdtfl="http://schemas.microsoft.com/office/word/2024/wordml/sdtformatlock" xmlns:w16se="http://schemas.microsoft.com/office/word/2015/wordml/symex" xmlns:wpg="http://schemas.microsoft.com/office/word/2010/wordprocessingGroup" xmlns:wpi="http://schemas.microsoft.com/office/word/2010/wordprocessingInk" xmlns:wne="http://schemas.microsoft.com/office/word/2006/wordml" xmlns:wps="http://schemas.microsoft.com/office/word/2010/wordprocessingShape" mc:Ignorable="w14 w15 w16se w16cid w16 w16cex w16sdtdh w16sdtfl w16du wp14">
   <w:p>
     <w:pPr>
       <w:pStyle w:val="Header"/>
@@ -3349,7 +2848,7 @@
 </file>
 
 <file path=word/header3.xml><?xml version="1.0" encoding="utf-8"?>
-<w:hdr xmlns:wpc="http://schemas.microsoft.com/office/word/2010/wordprocessingCanvas" xmlns:cx="http://schemas.microsoft.com/office/drawing/2014/chartex" xmlns:cx1="http://schemas.microsoft.com/office/drawing/2015/9/8/chartex" xmlns:cx2="http://schemas.microsoft.com/office/drawing/2015/10/21/chartex" xmlns:cx3="http://schemas.microsoft.com/office/drawing/2016/5/9/chartex" xmlns:cx4="http://schemas.microsoft.com/office/drawing/2016/5/10/chartex" xmlns:cx5="http://schemas.microsoft.com/office/drawing/2016/5/11/chartex" xmlns:cx6="http://schemas.microsoft.com/office/drawing/2016/5/12/chartex" xmlns:cx7="http://schemas.microsoft.com/office/drawing/2016/5/13/chartex" xmlns:cx8="http://schemas.microsoft.com/office/drawing/2016/5/14/chartex" xmlns:mc="http://schemas.openxmlformats.org/markup-compatibility/2006" xmlns:aink="http://schemas.microsoft.com/office/drawing/2016/ink" xmlns:am3d="http://schemas.microsoft.com/office/drawing/2017/model3d" xmlns:o="urn:schemas-microsoft-com:office:office" xmlns:oel="http://schemas.microsoft.com/office/2019/extlst" xmlns:r="http://schemas.openxmlformats.org/officeDocument/2006/relationships" xmlns:m="http://schemas.openxmlformats.org/officeDocument/2006/math" xmlns:v="urn:schemas-microsoft-com:vml" xmlns:wp14="http://schemas.microsoft.com/office/word/2010/wordprocessingDrawing" xmlns:wp="http://schemas.openxmlformats.org/drawingml/2006/wordprocessingDrawing" xmlns:w10="urn:schemas-microsoft-com:office:word" xmlns:w="http://schemas.openxmlformats.org/wordprocessingml/2006/main" xmlns:w14="http://schemas.microsoft.com/office/word/2010/wordml" xmlns:w15="http://schemas.microsoft.com/office/word/2012/wordml" xmlns:w16cei="http://schemas.microsoft.com/office/word/2026/wordml/cei" xmlns:w16cex="http://schemas.microsoft.com/office/word/2018/wordml/cex" xmlns:w16cid="http://schemas.microsoft.com/office/word/2016/wordml/cid" xmlns:w16="http://schemas.microsoft.com/office/word/2018/wordml" xmlns:w16du="http://schemas.microsoft.com/office/word/2023/wordml/word16du" xmlns:w16sdtdh="http://schemas.microsoft.com/office/word/2020/wordml/sdtdatahash" xmlns:w16sdtfl="http://schemas.microsoft.com/office/word/2024/wordml/sdtformatlock" xmlns:w16se="http://schemas.microsoft.com/office/word/2015/wordml/symex" xmlns:wpg="http://schemas.microsoft.com/office/word/2010/wordprocessingGroup" xmlns:wpi="http://schemas.microsoft.com/office/word/2010/wordprocessingInk" xmlns:wne="http://schemas.microsoft.com/office/word/2006/wordml" xmlns:wps="http://schemas.microsoft.com/office/word/2010/wordprocessingShape" mc:Ignorable="w14 w15 w16se w16cid w16 w16cex w16sdtdh w16sdtfl w16du wp14">
+<w:hdr xmlns:wpc="http://schemas.microsoft.com/office/word/2010/wordprocessingCanvas" xmlns:cx="http://schemas.microsoft.com/office/drawing/2014/chartex" xmlns:cx1="http://schemas.microsoft.com/office/drawing/2015/9/8/chartex" xmlns:cx2="http://schemas.microsoft.com/office/drawing/2015/10/21/chartex" xmlns:cx3="http://schemas.microsoft.com/office/drawing/2016/5/9/chartex" xmlns:cx4="http://schemas.microsoft.com/office/drawing/2016/5/10/chartex" xmlns:cx5="http://schemas.microsoft.com/office/drawing/2016/5/11/chartex" xmlns:cx6="http://schemas.microsoft.com/office/drawing/2016/5/12/chartex" xmlns:cx7="http://schemas.microsoft.com/office/drawing/2016/5/13/chartex" xmlns:cx8="http://schemas.microsoft.com/office/drawing/2016/5/14/chartex" xmlns:mc="http://schemas.openxmlformats.org/markup-compatibility/2006" xmlns:aink="http://schemas.microsoft.com/office/drawing/2016/ink" xmlns:am3d="http://schemas.microsoft.com/office/drawing/2017/model3d" xmlns:o="urn:schemas-microsoft-com:office:office" xmlns:oel="http://schemas.microsoft.com/office/2019/extlst" xmlns:r="http://schemas.openxmlformats.org/officeDocument/2006/relationships" xmlns:m="http://schemas.openxmlformats.org/officeDocument/2006/math" xmlns:v="urn:schemas-microsoft-com:vml" xmlns:wp14="http://schemas.microsoft.com/office/word/2010/wordprocessingDrawing" xmlns:wp="http://schemas.openxmlformats.org/drawingml/2006/wordprocessingDrawing" xmlns:w10="urn:schemas-microsoft-com:office:word" xmlns:w="http://schemas.openxmlformats.org/wordprocessingml/2006/main" xmlns:w14="http://schemas.microsoft.com/office/word/2010/wordml" xmlns:w15="http://schemas.microsoft.com/office/word/2012/wordml" xmlns:w16cex="http://schemas.microsoft.com/office/word/2018/wordml/cex" xmlns:w16cid="http://schemas.microsoft.com/office/word/2016/wordml/cid" xmlns:w16="http://schemas.microsoft.com/office/word/2018/wordml" xmlns:w16du="http://schemas.microsoft.com/office/word/2023/wordml/word16du" xmlns:w16sdtdh="http://schemas.microsoft.com/office/word/2020/wordml/sdtdatahash" xmlns:w16sdtfl="http://schemas.microsoft.com/office/word/2024/wordml/sdtformatlock" xmlns:w16se="http://schemas.microsoft.com/office/word/2015/wordml/symex" xmlns:wpg="http://schemas.microsoft.com/office/word/2010/wordprocessingGroup" xmlns:wpi="http://schemas.microsoft.com/office/word/2010/wordprocessingInk" xmlns:wne="http://schemas.microsoft.com/office/word/2006/wordml" xmlns:wps="http://schemas.microsoft.com/office/word/2010/wordprocessingShape" mc:Ignorable="w14 w15 w16se w16cid w16 w16cex w16sdtdh w16sdtfl w16du wp14">
   <w:tbl>
     <w:tblPr>
       <w:tblStyle w:val="TableGrid"/>
@@ -3460,7 +2959,6 @@
             <w:t>IF_HA_Northern</w:t>
           </w:r>
           <w:proofErr w:type="spellEnd"/>
-          <w:proofErr w:type="gramStart"/>
           <w:r>
             <w:rPr>
               <w:kern w:val="2"/>
@@ -3469,18 +2967,7 @@
               <w:lang w:val="en-CA" w:eastAsia="en-CA"/>
               <w14:ligatures w14:val="standardContextual"/>
             </w:rPr>
-            <w:t>}}{</w:t>
-          </w:r>
-          <w:proofErr w:type="gramEnd"/>
-          <w:r>
-            <w:rPr>
-              <w:kern w:val="2"/>
-              <w:sz w:val="14"/>
-              <w:szCs w:val="14"/>
-              <w:lang w:val="en-CA" w:eastAsia="en-CA"/>
-              <w14:ligatures w14:val="standardContextual"/>
-            </w:rPr>
-            <w:t>{#IF_HA_Interior}}</w:t>
+            <w:t>}}{{#IF_HA_Interior}}</w:t>
           </w:r>
           <w:r>
             <w:rPr>
@@ -3548,7 +3035,6 @@
             <w:t>IF_HA_Interior</w:t>
           </w:r>
           <w:proofErr w:type="spellEnd"/>
-          <w:proofErr w:type="gramStart"/>
           <w:r>
             <w:rPr>
               <w:kern w:val="2"/>
@@ -3557,18 +3043,7 @@
               <w:lang w:val="en-CA" w:eastAsia="en-CA"/>
               <w14:ligatures w14:val="standardContextual"/>
             </w:rPr>
-            <w:t>}}{</w:t>
-          </w:r>
-          <w:proofErr w:type="gramEnd"/>
-          <w:r>
-            <w:rPr>
-              <w:kern w:val="2"/>
-              <w:sz w:val="14"/>
-              <w:szCs w:val="14"/>
-              <w:lang w:val="en-CA" w:eastAsia="en-CA"/>
-              <w14:ligatures w14:val="standardContextual"/>
-            </w:rPr>
-            <w:t>{#IF_HA_Island}}</w:t>
+            <w:t>}}{{#IF_HA_Island}}</w:t>
           </w:r>
           <w:r>
             <w:rPr>
@@ -3976,7 +3451,7 @@
 </file>
 
 <file path=word/numbering.xml><?xml version="1.0" encoding="utf-8"?>
-<w:numbering xmlns:wpc="http://schemas.microsoft.com/office/word/2010/wordprocessingCanvas" xmlns:cx="http://schemas.microsoft.com/office/drawing/2014/chartex" xmlns:cx1="http://schemas.microsoft.com/office/drawing/2015/9/8/chartex" xmlns:cx2="http://schemas.microsoft.com/office/drawing/2015/10/21/chartex" xmlns:cx3="http://schemas.microsoft.com/office/drawing/2016/5/9/chartex" xmlns:cx4="http://schemas.microsoft.com/office/drawing/2016/5/10/chartex" xmlns:cx5="http://schemas.microsoft.com/office/drawing/2016/5/11/chartex" xmlns:cx6="http://schemas.microsoft.com/office/drawing/2016/5/12/chartex" xmlns:cx7="http://schemas.microsoft.com/office/drawing/2016/5/13/chartex" xmlns:cx8="http://schemas.microsoft.com/office/drawing/2016/5/14/chartex" xmlns:mc="http://schemas.openxmlformats.org/markup-compatibility/2006" xmlns:aink="http://schemas.microsoft.com/office/drawing/2016/ink" xmlns:am3d="http://schemas.microsoft.com/office/drawing/2017/model3d" xmlns:o="urn:schemas-microsoft-com:office:office" xmlns:oel="http://schemas.microsoft.com/office/2019/extlst" xmlns:r="http://schemas.openxmlformats.org/officeDocument/2006/relationships" xmlns:m="http://schemas.openxmlformats.org/officeDocument/2006/math" xmlns:v="urn:schemas-microsoft-com:vml" xmlns:wp14="http://schemas.microsoft.com/office/word/2010/wordprocessingDrawing" xmlns:wp="http://schemas.openxmlformats.org/drawingml/2006/wordprocessingDrawing" xmlns:w10="urn:schemas-microsoft-com:office:word" xmlns:w="http://schemas.openxmlformats.org/wordprocessingml/2006/main" xmlns:w14="http://schemas.microsoft.com/office/word/2010/wordml" xmlns:w15="http://schemas.microsoft.com/office/word/2012/wordml" xmlns:w16cei="http://schemas.microsoft.com/office/word/2026/wordml/cei" xmlns:w16cex="http://schemas.microsoft.com/office/word/2018/wordml/cex" xmlns:w16cid="http://schemas.microsoft.com/office/word/2016/wordml/cid" xmlns:w16="http://schemas.microsoft.com/office/word/2018/wordml" xmlns:w16du="http://schemas.microsoft.com/office/word/2023/wordml/word16du" xmlns:w16sdtdh="http://schemas.microsoft.com/office/word/2020/wordml/sdtdatahash" xmlns:w16sdtfl="http://schemas.microsoft.com/office/word/2024/wordml/sdtformatlock" xmlns:w16se="http://schemas.microsoft.com/office/word/2015/wordml/symex" xmlns:wpg="http://schemas.microsoft.com/office/word/2010/wordprocessingGroup" xmlns:wpi="http://schemas.microsoft.com/office/word/2010/wordprocessingInk" xmlns:wne="http://schemas.microsoft.com/office/word/2006/wordml" xmlns:wps="http://schemas.microsoft.com/office/word/2010/wordprocessingShape" mc:Ignorable="w14 w15 w16se w16cid w16 w16cex w16sdtdh w16sdtfl w16du wp14">
+<w:numbering xmlns:wpc="http://schemas.microsoft.com/office/word/2010/wordprocessingCanvas" xmlns:cx="http://schemas.microsoft.com/office/drawing/2014/chartex" xmlns:cx1="http://schemas.microsoft.com/office/drawing/2015/9/8/chartex" xmlns:cx2="http://schemas.microsoft.com/office/drawing/2015/10/21/chartex" xmlns:cx3="http://schemas.microsoft.com/office/drawing/2016/5/9/chartex" xmlns:cx4="http://schemas.microsoft.com/office/drawing/2016/5/10/chartex" xmlns:cx5="http://schemas.microsoft.com/office/drawing/2016/5/11/chartex" xmlns:cx6="http://schemas.microsoft.com/office/drawing/2016/5/12/chartex" xmlns:cx7="http://schemas.microsoft.com/office/drawing/2016/5/13/chartex" xmlns:cx8="http://schemas.microsoft.com/office/drawing/2016/5/14/chartex" xmlns:mc="http://schemas.openxmlformats.org/markup-compatibility/2006" xmlns:aink="http://schemas.microsoft.com/office/drawing/2016/ink" xmlns:am3d="http://schemas.microsoft.com/office/drawing/2017/model3d" xmlns:o="urn:schemas-microsoft-com:office:office" xmlns:oel="http://schemas.microsoft.com/office/2019/extlst" xmlns:r="http://schemas.openxmlformats.org/officeDocument/2006/relationships" xmlns:m="http://schemas.openxmlformats.org/officeDocument/2006/math" xmlns:v="urn:schemas-microsoft-com:vml" xmlns:wp14="http://schemas.microsoft.com/office/word/2010/wordprocessingDrawing" xmlns:wp="http://schemas.openxmlformats.org/drawingml/2006/wordprocessingDrawing" xmlns:w10="urn:schemas-microsoft-com:office:word" xmlns:w="http://schemas.openxmlformats.org/wordprocessingml/2006/main" xmlns:w14="http://schemas.microsoft.com/office/word/2010/wordml" xmlns:w15="http://schemas.microsoft.com/office/word/2012/wordml" xmlns:w16cex="http://schemas.microsoft.com/office/word/2018/wordml/cex" xmlns:w16cid="http://schemas.microsoft.com/office/word/2016/wordml/cid" xmlns:w16="http://schemas.microsoft.com/office/word/2018/wordml" xmlns:w16du="http://schemas.microsoft.com/office/word/2023/wordml/word16du" xmlns:w16sdtdh="http://schemas.microsoft.com/office/word/2020/wordml/sdtdatahash" xmlns:w16sdtfl="http://schemas.microsoft.com/office/word/2024/wordml/sdtformatlock" xmlns:w16se="http://schemas.microsoft.com/office/word/2015/wordml/symex" xmlns:wpg="http://schemas.microsoft.com/office/word/2010/wordprocessingGroup" xmlns:wpi="http://schemas.microsoft.com/office/word/2010/wordprocessingInk" xmlns:wne="http://schemas.microsoft.com/office/word/2006/wordml" xmlns:wps="http://schemas.microsoft.com/office/word/2010/wordprocessingShape" mc:Ignorable="w14 w15 w16se w16cid w16 w16cex w16sdtdh w16sdtfl w16du wp14">
   <w:abstractNum w:abstractNumId="0" w15:restartNumberingAfterBreak="0">
     <w:nsid w:val="0DA81AFA"/>
     <w:multiLevelType w:val="hybridMultilevel"/>
@@ -5340,6 +4815,120 @@
       <w14:ligatures w14:val="none"/>
     </w:rPr>
   </w:style>
+  <w:style w:type="character" w:styleId="BookTitle">
+    <w:name w:val="Book Title"/>
+    <w:basedOn w:val="DefaultParagraphFont"/>
+    <w:uiPriority w:val="33"/>
+    <w:qFormat/>
+    <w:rsid w:val="00274112"/>
+    <w:rPr>
+      <w:b/>
+      <w:bCs/>
+      <w:i/>
+      <w:iCs/>
+      <w:spacing w:val="5"/>
+    </w:rPr>
+  </w:style>
+  <w:style w:type="paragraph" w:styleId="Caption">
+    <w:name w:val="caption"/>
+    <w:basedOn w:val="Normal"/>
+    <w:next w:val="Normal"/>
+    <w:uiPriority w:val="35"/>
+    <w:semiHidden/>
+    <w:unhideWhenUsed/>
+    <w:qFormat/>
+    <w:rsid w:val="00274112"/>
+    <w:pPr>
+      <w:spacing w:after="200"/>
+    </w:pPr>
+    <w:rPr>
+      <w:i/>
+      <w:iCs/>
+      <w:color w:val="44546A" w:themeColor="text2"/>
+      <w:sz w:val="18"/>
+      <w:szCs w:val="18"/>
+    </w:rPr>
+  </w:style>
+  <w:style w:type="character" w:styleId="Emphasis">
+    <w:name w:val="Emphasis"/>
+    <w:basedOn w:val="DefaultParagraphFont"/>
+    <w:uiPriority w:val="20"/>
+    <w:qFormat/>
+    <w:rsid w:val="00274112"/>
+    <w:rPr>
+      <w:i/>
+      <w:iCs/>
+    </w:rPr>
+  </w:style>
+  <w:style w:type="paragraph" w:styleId="NoSpacing">
+    <w:name w:val="No Spacing"/>
+    <w:uiPriority w:val="1"/>
+    <w:qFormat/>
+    <w:rsid w:val="00274112"/>
+    <w:pPr>
+      <w:spacing w:after="0" w:line="240" w:lineRule="auto"/>
+    </w:pPr>
+    <w:rPr>
+      <w:rFonts w:ascii="Arial" w:eastAsia="Arial" w:hAnsi="Arial" w:cs="Arial"/>
+      <w:kern w:val="0"/>
+      <w:sz w:val="20"/>
+      <w:szCs w:val="20"/>
+      <w:lang w:val="en"/>
+      <w14:ligatures w14:val="none"/>
+    </w:rPr>
+  </w:style>
+  <w:style w:type="character" w:styleId="Strong">
+    <w:name w:val="Strong"/>
+    <w:basedOn w:val="DefaultParagraphFont"/>
+    <w:uiPriority w:val="22"/>
+    <w:qFormat/>
+    <w:rsid w:val="00274112"/>
+    <w:rPr>
+      <w:b/>
+      <w:bCs/>
+    </w:rPr>
+  </w:style>
+  <w:style w:type="character" w:styleId="SubtleEmphasis">
+    <w:name w:val="Subtle Emphasis"/>
+    <w:basedOn w:val="DefaultParagraphFont"/>
+    <w:uiPriority w:val="19"/>
+    <w:qFormat/>
+    <w:rsid w:val="00274112"/>
+    <w:rPr>
+      <w:i/>
+      <w:iCs/>
+      <w:color w:val="404040" w:themeColor="text1" w:themeTint="BF"/>
+    </w:rPr>
+  </w:style>
+  <w:style w:type="character" w:styleId="SubtleReference">
+    <w:name w:val="Subtle Reference"/>
+    <w:basedOn w:val="DefaultParagraphFont"/>
+    <w:uiPriority w:val="31"/>
+    <w:qFormat/>
+    <w:rsid w:val="00274112"/>
+    <w:rPr>
+      <w:smallCaps/>
+      <w:color w:val="5A5A5A" w:themeColor="text1" w:themeTint="A5"/>
+    </w:rPr>
+  </w:style>
+  <w:style w:type="paragraph" w:styleId="TOCHeading">
+    <w:name w:val="TOC Heading"/>
+    <w:basedOn w:val="Heading1"/>
+    <w:next w:val="Normal"/>
+    <w:uiPriority w:val="39"/>
+    <w:semiHidden/>
+    <w:unhideWhenUsed/>
+    <w:qFormat/>
+    <w:rsid w:val="00274112"/>
+    <w:pPr>
+      <w:spacing w:before="240" w:after="0"/>
+      <w:outlineLvl w:val="9"/>
+    </w:pPr>
+    <w:rPr>
+      <w:sz w:val="32"/>
+      <w:szCs w:val="32"/>
+    </w:rPr>
+  </w:style>
 </w:styles>
 </file>
 

</xml_diff>